<commit_message>
August lists and images
</commit_message>
<xml_diff>
--- a/docs/BYREGION/Женщины_Алтая.docx
+++ b/docs/BYREGION/Женщины_Алтая.docx
@@ -1,6 +1,6 @@
 
 <file path=word/document.xml><?xml version="1.0" encoding="utf-8"?>
-<w:document xmlns:wpc="http://schemas.microsoft.com/office/word/2010/wordprocessingCanvas" xmlns:cx="http://schemas.microsoft.com/office/drawing/2014/chartex" xmlns:cx1="http://schemas.microsoft.com/office/drawing/2015/9/8/chartex" xmlns:cx2="http://schemas.microsoft.com/office/drawing/2015/10/21/chartex" xmlns:cx3="http://schemas.microsoft.com/office/drawing/2016/5/9/chartex" xmlns:cx4="http://schemas.microsoft.com/office/drawing/2016/5/10/chartex" xmlns:cx5="http://schemas.microsoft.com/office/drawing/2016/5/11/chartex" xmlns:cx6="http://schemas.microsoft.com/office/drawing/2016/5/12/chartex" xmlns:cx7="http://schemas.microsoft.com/office/drawing/2016/5/13/chartex" xmlns:cx8="http://schemas.microsoft.com/office/drawing/2016/5/14/chartex" xmlns:mc="http://schemas.openxmlformats.org/markup-compatibility/2006" xmlns:aink="http://schemas.microsoft.com/office/drawing/2016/ink" xmlns:am3d="http://schemas.microsoft.com/office/drawing/2017/model3d" xmlns:o="urn:schemas-microsoft-com:office:office" xmlns:oel="http://schemas.microsoft.com/office/2019/extlst" xmlns:r="http://schemas.openxmlformats.org/officeDocument/2006/relationships" xmlns:m="http://schemas.openxmlformats.org/officeDocument/2006/math" xmlns:v="urn:schemas-microsoft-com:vml" xmlns:wp14="http://schemas.microsoft.com/office/word/2010/wordprocessingDrawing" xmlns:wp="http://schemas.openxmlformats.org/drawingml/2006/wordprocessingDrawing" xmlns:w10="urn:schemas-microsoft-com:office:word" xmlns:w="http://schemas.openxmlformats.org/wordprocessingml/2006/main" xmlns:w14="http://schemas.microsoft.com/office/word/2010/wordml" xmlns:w15="http://schemas.microsoft.com/office/word/2012/wordml" xmlns:w16cex="http://schemas.microsoft.com/office/word/2018/wordml/cex" xmlns:w16cid="http://schemas.microsoft.com/office/word/2016/wordml/cid" xmlns:w16="http://schemas.microsoft.com/office/word/2018/wordml" xmlns:w16du="http://schemas.microsoft.com/office/word/2023/wordml/word16du" xmlns:w16sdtdh="http://schemas.microsoft.com/office/word/2020/wordml/sdtdatahash" xmlns:w16sdtfl="http://schemas.microsoft.com/office/word/2024/wordml/sdtformatlock" xmlns:w16se="http://schemas.microsoft.com/office/word/2015/wordml/symex" xmlns:wpg="http://schemas.microsoft.com/office/word/2010/wordprocessingGroup" xmlns:wpi="http://schemas.microsoft.com/office/word/2010/wordprocessingInk" xmlns:wne="http://schemas.microsoft.com/office/word/2006/wordml" xmlns:wps="http://schemas.microsoft.com/office/word/2010/wordprocessingShape" mc:Ignorable="w14 w15 w16se w16cid w16 w16cex w16sdtdh w16sdtfl w16du wp14">
+<w:document xmlns:wpc="http://schemas.microsoft.com/office/word/2010/wordprocessingCanvas" xmlns:cx="http://schemas.microsoft.com/office/drawing/2014/chartex" xmlns:cx1="http://schemas.microsoft.com/office/drawing/2015/9/8/chartex" xmlns:cx2="http://schemas.microsoft.com/office/drawing/2015/10/21/chartex" xmlns:cx3="http://schemas.microsoft.com/office/drawing/2016/5/9/chartex" xmlns:cx4="http://schemas.microsoft.com/office/drawing/2016/5/10/chartex" xmlns:cx5="http://schemas.microsoft.com/office/drawing/2016/5/11/chartex" xmlns:cx6="http://schemas.microsoft.com/office/drawing/2016/5/12/chartex" xmlns:cx7="http://schemas.microsoft.com/office/drawing/2016/5/13/chartex" xmlns:cx8="http://schemas.microsoft.com/office/drawing/2016/5/14/chartex" xmlns:mc="http://schemas.openxmlformats.org/markup-compatibility/2006" xmlns:aink="http://schemas.microsoft.com/office/drawing/2016/ink" xmlns:am3d="http://schemas.microsoft.com/office/drawing/2017/model3d" xmlns:o="urn:schemas-microsoft-com:office:office" xmlns:oel="http://schemas.microsoft.com/office/2019/extlst" xmlns:r="http://schemas.openxmlformats.org/officeDocument/2006/relationships" xmlns:m="http://schemas.openxmlformats.org/officeDocument/2006/math" xmlns:v="urn:schemas-microsoft-com:vml" xmlns:wp14="http://schemas.microsoft.com/office/word/2010/wordprocessingDrawing" xmlns:wp="http://schemas.openxmlformats.org/drawingml/2006/wordprocessingDrawing" xmlns:w10="urn:schemas-microsoft-com:office:word" xmlns:w="http://schemas.openxmlformats.org/wordprocessingml/2006/main" xmlns:w14="http://schemas.microsoft.com/office/word/2010/wordml" xmlns:w15="http://schemas.microsoft.com/office/word/2012/wordml" xmlns:w16cei="http://schemas.microsoft.com/office/word/2026/wordml/cei" xmlns:w16cex="http://schemas.microsoft.com/office/word/2018/wordml/cex" xmlns:w16cid="http://schemas.microsoft.com/office/word/2016/wordml/cid" xmlns:w16="http://schemas.microsoft.com/office/word/2018/wordml" xmlns:w16du="http://schemas.microsoft.com/office/word/2023/wordml/word16du" xmlns:w16sdtdh="http://schemas.microsoft.com/office/word/2020/wordml/sdtdatahash" xmlns:w16sdtfl="http://schemas.microsoft.com/office/word/2024/wordml/sdtformatlock" xmlns:w16se="http://schemas.microsoft.com/office/word/2015/wordml/symex" xmlns:wpg="http://schemas.microsoft.com/office/word/2010/wordprocessingGroup" xmlns:wpi="http://schemas.microsoft.com/office/word/2010/wordprocessingInk" xmlns:wne="http://schemas.microsoft.com/office/word/2006/wordml" xmlns:wps="http://schemas.microsoft.com/office/word/2010/wordprocessingShape" mc:Ignorable="w14 w15 w16se w16cid w16 w16cex w16sdtdh w16sdtfl w16du wp14">
   <w:body>
     <w:p>
       <w:pPr>
@@ -133,7 +133,28 @@
           <w:szCs w:val="18"/>
           <w:lang w:val="ru-RU"/>
         </w:rPr>
-        <w:t>13 имен</w:t>
+        <w:t>1</w:t>
+      </w:r>
+      <w:r>
+        <w:rPr>
+          <w:rFonts w:ascii="Arial" w:hAnsi="Arial" w:cs="Arial"/>
+          <w:b/>
+          <w:bCs/>
+          <w:sz w:val="18"/>
+          <w:szCs w:val="18"/>
+        </w:rPr>
+        <w:t>4</w:t>
+      </w:r>
+      <w:r>
+        <w:rPr>
+          <w:rFonts w:ascii="Arial" w:hAnsi="Arial" w:cs="Arial"/>
+          <w:b/>
+          <w:bCs/>
+          <w:sz w:val="18"/>
+          <w:szCs w:val="18"/>
+          <w:lang w:val="ru-RU"/>
+        </w:rPr>
+        <w:t xml:space="preserve"> имен</w:t>
       </w:r>
     </w:p>
     <w:tbl>
@@ -413,7 +434,6 @@
                 <w:rFonts w:ascii="Arial" w:hAnsi="Arial" w:cs="Arial"/>
                 <w:sz w:val="16"/>
                 <w:szCs w:val="16"/>
-                <w:lang w:val="ru-RU"/>
               </w:rPr>
             </w:pPr>
             <w:r>
@@ -424,6 +444,34 @@
                 <w:lang w:val="ru-RU"/>
               </w:rPr>
               <w:t>9 (69%) – реабилитированы.</w:t>
+            </w:r>
+          </w:p>
+          <w:p>
+            <w:pPr>
+              <w:rPr>
+                <w:rFonts w:ascii="Arial" w:hAnsi="Arial" w:cs="Arial"/>
+                <w:sz w:val="16"/>
+                <w:szCs w:val="16"/>
+                <w:lang w:val="ru-RU"/>
+              </w:rPr>
+            </w:pPr>
+            <w:r>
+              <w:rPr>
+                <w:rFonts w:ascii="Arial" w:hAnsi="Arial" w:cs="Arial"/>
+                <w:sz w:val="16"/>
+                <w:szCs w:val="16"/>
+                <w:lang w:val="ru-RU"/>
+              </w:rPr>
+              <w:t>У одной женщины одновременно с ней расстреляны двое ее сыновей</w:t>
+            </w:r>
+            <w:r>
+              <w:rPr>
+                <w:rFonts w:ascii="Arial" w:hAnsi="Arial" w:cs="Arial"/>
+                <w:sz w:val="16"/>
+                <w:szCs w:val="16"/>
+                <w:lang w:val="ru-RU"/>
+              </w:rPr>
+              <w:t>.</w:t>
             </w:r>
           </w:p>
         </w:tc>
@@ -471,7 +519,19 @@
           <w:szCs w:val="16"/>
           <w:lang w:val="ru-RU"/>
         </w:rPr>
-        <w:t>ЧИСЛЕННОСТЬ РАССТРЕЛЯННЫХ ЖЕНЩИН ПО ГОДАМ</w:t>
+        <w:t xml:space="preserve">ЧИСЛЕННОСТЬ РАССТРЕЛЯННЫХ ЖЕНЩИН ПО ГОДАМ, </w:t>
+      </w:r>
+      <w:proofErr w:type="gramStart"/>
+      <w:r>
+        <w:rPr>
+          <w:rFonts w:ascii="Arial" w:hAnsi="Arial" w:cs="Arial"/>
+          <w:b/>
+          <w:bCs/>
+          <w:sz w:val="16"/>
+          <w:szCs w:val="16"/>
+          <w:lang w:val="ru-RU"/>
+        </w:rPr>
+        <w:t>19</w:t>
       </w:r>
       <w:r>
         <w:rPr>
@@ -482,7 +542,7 @@
           <w:szCs w:val="16"/>
           <w:lang w:val="ru-RU"/>
         </w:rPr>
-        <w:t xml:space="preserve">, </w:t>
+        <w:t>22</w:t>
       </w:r>
       <w:r>
         <w:rPr>
@@ -493,8 +553,9 @@
           <w:szCs w:val="16"/>
           <w:lang w:val="ru-RU"/>
         </w:rPr>
-        <w:t>1931</w:t>
+        <w:t>-1938</w:t>
       </w:r>
+      <w:proofErr w:type="gramEnd"/>
       <w:r>
         <w:rPr>
           <w:rFonts w:ascii="Arial" w:hAnsi="Arial" w:cs="Arial"/>
@@ -504,18 +565,7 @@
           <w:szCs w:val="16"/>
           <w:lang w:val="ru-RU"/>
         </w:rPr>
-        <w:t>-</w:t>
-      </w:r>
-      <w:r>
-        <w:rPr>
-          <w:rFonts w:ascii="Arial" w:hAnsi="Arial" w:cs="Arial"/>
-          <w:b/>
-          <w:bCs/>
-          <w:sz w:val="16"/>
-          <w:szCs w:val="16"/>
-          <w:lang w:val="ru-RU"/>
-        </w:rPr>
-        <w:t>1938 гг.</w:t>
+        <w:t xml:space="preserve"> гг.</w:t>
       </w:r>
     </w:p>
     <w:p>
@@ -537,10 +587,10 @@
           <w:lang w:val="ru-RU"/>
         </w:rPr>
         <w:drawing>
-          <wp:inline distT="0" distB="0" distL="0" distR="0" wp14:anchorId="06CE7859" wp14:editId="6A250B0A">
-            <wp:extent cx="3347085" cy="1786255"/>
-            <wp:effectExtent l="0" t="0" r="5715" b="4445"/>
-            <wp:docPr id="1596593218" name="Picture 1"/>
+          <wp:inline distT="0" distB="0" distL="0" distR="0" wp14:anchorId="53204A49" wp14:editId="18CEB2A8">
+            <wp:extent cx="3352800" cy="1847215"/>
+            <wp:effectExtent l="0" t="0" r="0" b="635"/>
+            <wp:docPr id="1718825071" name="Picture 4"/>
             <wp:cNvGraphicFramePr>
               <a:graphicFrameLocks xmlns:a="http://schemas.openxmlformats.org/drawingml/2006/main" noChangeAspect="1"/>
             </wp:cNvGraphicFramePr>
@@ -548,7 +598,7 @@
               <a:graphicData uri="http://schemas.openxmlformats.org/drawingml/2006/picture">
                 <pic:pic xmlns:pic="http://schemas.openxmlformats.org/drawingml/2006/picture">
                   <pic:nvPicPr>
-                    <pic:cNvPr id="0" name="Picture 2"/>
+                    <pic:cNvPr id="0" name="Picture 5"/>
                     <pic:cNvPicPr>
                       <a:picLocks noChangeAspect="1" noChangeArrowheads="1"/>
                     </pic:cNvPicPr>
@@ -569,7 +619,7 @@
                   <pic:spPr bwMode="auto">
                     <a:xfrm>
                       <a:off x="0" y="0"/>
-                      <a:ext cx="3347085" cy="1786255"/>
+                      <a:ext cx="3352800" cy="1847215"/>
                     </a:xfrm>
                     <a:prstGeom prst="rect">
                       <a:avLst/>
@@ -616,7 +666,19 @@
           <w:szCs w:val="16"/>
           <w:lang w:val="ru-RU"/>
         </w:rPr>
-        <w:t xml:space="preserve">ЧИСЛЕННОСТЬ РАССТРЕЛЯННЫХ ЖЕНЩИН ПО </w:t>
+        <w:t xml:space="preserve">ЧИСЛЕННОСТЬ РАССТРЕЛЯННЫХ ЖЕНЩИН ПО ВОЗРАСТАМ, </w:t>
+      </w:r>
+      <w:proofErr w:type="gramStart"/>
+      <w:r>
+        <w:rPr>
+          <w:rFonts w:ascii="Arial" w:hAnsi="Arial" w:cs="Arial"/>
+          <w:b/>
+          <w:bCs/>
+          <w:sz w:val="16"/>
+          <w:szCs w:val="16"/>
+          <w:lang w:val="ru-RU"/>
+        </w:rPr>
+        <w:t>19</w:t>
       </w:r>
       <w:r>
         <w:rPr>
@@ -627,7 +689,7 @@
           <w:szCs w:val="16"/>
           <w:lang w:val="ru-RU"/>
         </w:rPr>
-        <w:t>ВОЗРАСТАМ</w:t>
+        <w:t>22</w:t>
       </w:r>
       <w:r>
         <w:rPr>
@@ -638,8 +700,9 @@
           <w:szCs w:val="16"/>
           <w:lang w:val="ru-RU"/>
         </w:rPr>
-        <w:t xml:space="preserve">, </w:t>
+        <w:t>-1938</w:t>
       </w:r>
+      <w:proofErr w:type="gramEnd"/>
       <w:r>
         <w:rPr>
           <w:rFonts w:ascii="Arial" w:hAnsi="Arial" w:cs="Arial"/>
@@ -649,29 +712,7 @@
           <w:szCs w:val="16"/>
           <w:lang w:val="ru-RU"/>
         </w:rPr>
-        <w:t>1931</w:t>
-      </w:r>
-      <w:r>
-        <w:rPr>
-          <w:rFonts w:ascii="Arial" w:hAnsi="Arial" w:cs="Arial"/>
-          <w:b/>
-          <w:bCs/>
-          <w:sz w:val="16"/>
-          <w:szCs w:val="16"/>
-          <w:lang w:val="ru-RU"/>
-        </w:rPr>
-        <w:t>-</w:t>
-      </w:r>
-      <w:r>
-        <w:rPr>
-          <w:rFonts w:ascii="Arial" w:hAnsi="Arial" w:cs="Arial"/>
-          <w:b/>
-          <w:bCs/>
-          <w:sz w:val="16"/>
-          <w:szCs w:val="16"/>
-          <w:lang w:val="ru-RU"/>
-        </w:rPr>
-        <w:t>1938 гг.</w:t>
+        <w:t xml:space="preserve"> гг.</w:t>
       </w:r>
     </w:p>
     <w:p>
@@ -690,18 +731,16 @@
       <w:r>
         <w:rPr>
           <w:rFonts w:ascii="Arial" w:hAnsi="Arial" w:cs="Arial"/>
-          <w:b/>
-          <w:bCs/>
           <w:noProof/>
           <w:sz w:val="16"/>
           <w:szCs w:val="16"/>
           <w:lang w:val="ru-RU"/>
         </w:rPr>
         <w:drawing>
-          <wp:inline distT="0" distB="0" distL="0" distR="0" wp14:anchorId="703C99F6" wp14:editId="121FF653">
-            <wp:extent cx="3609340" cy="1469390"/>
-            <wp:effectExtent l="0" t="0" r="0" b="0"/>
-            <wp:docPr id="53595608" name="Picture 1"/>
+          <wp:inline distT="0" distB="0" distL="0" distR="0" wp14:anchorId="6BC52409" wp14:editId="05046E00">
+            <wp:extent cx="3609340" cy="1713230"/>
+            <wp:effectExtent l="0" t="0" r="0" b="1270"/>
+            <wp:docPr id="2064877929" name="Picture 1"/>
             <wp:cNvGraphicFramePr>
               <a:graphicFrameLocks xmlns:a="http://schemas.openxmlformats.org/drawingml/2006/main" noChangeAspect="1"/>
             </wp:cNvGraphicFramePr>
@@ -730,7 +769,7 @@
                   <pic:spPr bwMode="auto">
                     <a:xfrm>
                       <a:off x="0" y="0"/>
-                      <a:ext cx="3609340" cy="1469390"/>
+                      <a:ext cx="3609340" cy="1713230"/>
                     </a:xfrm>
                     <a:prstGeom prst="rect">
                       <a:avLst/>
@@ -886,23 +925,34 @@
                 <w:lang w:val="ru-RU"/>
               </w:rPr>
             </w:pPr>
-            <w:hyperlink r:id="rId8" w:history="1">
-              <w:r>
-                <w:rPr>
-                  <w:rStyle w:val="Hyperlink"/>
-                  <w:rFonts w:ascii="Arial" w:hAnsi="Arial" w:cs="Arial"/>
-                  <w:b/>
-                  <w:bCs/>
-                  <w:color w:val="auto"/>
-                  <w:sz w:val="16"/>
-                  <w:szCs w:val="16"/>
-                  <w:bdr w:val="none" w:sz="0" w:space="0" w:color="auto" w:frame="1"/>
-                  <w:shd w:val="clear" w:color="auto" w:fill="FFFFFF"/>
-                  <w:lang w:val="ru-RU"/>
-                </w:rPr>
-                <w:t>Базарова Хандажап</w:t>
-              </w:r>
-            </w:hyperlink>
+            <w:r>
+              <w:rPr>
+                <w:rFonts w:ascii="Arial" w:hAnsi="Arial" w:cs="Arial"/>
+                <w:b/>
+                <w:bCs/>
+                <w:sz w:val="16"/>
+                <w:szCs w:val="16"/>
+                <w:bdr w:val="none" w:sz="0" w:space="0" w:color="auto" w:frame="1"/>
+                <w:shd w:val="clear" w:color="auto" w:fill="FFFFFF"/>
+                <w:lang w:val="ru-RU"/>
+              </w:rPr>
+              <w:t xml:space="preserve">Базарова </w:t>
+            </w:r>
+            <w:proofErr w:type="spellStart"/>
+            <w:r>
+              <w:rPr>
+                <w:rFonts w:ascii="Arial" w:hAnsi="Arial" w:cs="Arial"/>
+                <w:b/>
+                <w:bCs/>
+                <w:sz w:val="16"/>
+                <w:szCs w:val="16"/>
+                <w:bdr w:val="none" w:sz="0" w:space="0" w:color="auto" w:frame="1"/>
+                <w:shd w:val="clear" w:color="auto" w:fill="FFFFFF"/>
+                <w:lang w:val="ru-RU"/>
+              </w:rPr>
+              <w:t>Хандажап</w:t>
+            </w:r>
+            <w:proofErr w:type="spellEnd"/>
             <w:r>
               <w:rPr>
                 <w:rStyle w:val="Hyperlink"/>
@@ -917,39 +967,7 @@
                 <w:shd w:val="clear" w:color="auto" w:fill="FFFFFF"/>
                 <w:lang w:val="ru-RU"/>
               </w:rPr>
-              <w:t xml:space="preserve"> </w:t>
-            </w:r>
-            <w:r>
-              <w:rPr>
-                <w:rStyle w:val="Hyperlink"/>
-                <w:rFonts w:ascii="Arial" w:hAnsi="Arial" w:cs="Arial"/>
-                <w:b/>
-                <w:bCs/>
-                <w:color w:val="auto"/>
-                <w:sz w:val="16"/>
-                <w:szCs w:val="16"/>
-                <w:u w:val="none"/>
-                <w:bdr w:val="none" w:sz="0" w:space="0" w:color="auto" w:frame="1"/>
-                <w:shd w:val="clear" w:color="auto" w:fill="FFFFFF"/>
-                <w:lang w:val="ru-RU"/>
-              </w:rPr>
-              <w:t>37 лет</w:t>
-            </w:r>
-            <w:r>
-              <w:rPr>
-                <w:rStyle w:val="Hyperlink"/>
-                <w:rFonts w:ascii="Arial" w:hAnsi="Arial" w:cs="Arial"/>
-                <w:b/>
-                <w:bCs/>
-                <w:color w:val="auto"/>
-                <w:sz w:val="16"/>
-                <w:szCs w:val="16"/>
-                <w:u w:val="none"/>
-                <w:bdr w:val="none" w:sz="0" w:space="0" w:color="auto" w:frame="1"/>
-                <w:shd w:val="clear" w:color="auto" w:fill="FFFFFF"/>
-                <w:lang w:val="ru-RU"/>
-              </w:rPr>
-              <w:t xml:space="preserve"> </w:t>
+              <w:t xml:space="preserve"> 37 лет </w:t>
             </w:r>
           </w:p>
           <w:p>
@@ -972,26 +990,139 @@
                 <w:szCs w:val="16"/>
                 <w:lang w:val="ru-RU"/>
               </w:rPr>
-              <w:t>1900 г.р., м.р.: Забайкальская обл., Читинский уезд, с. Уронай, бурятка. БОЗ.прож.: Читинская обл., Шилкинский р-н, ст. Холбон, арестована 12.10.1937. Обвинение: по ст. 58-1а, 58-9, 58-11 УК РСФСР.Приговор: Тройкой УНКВД по Читинской обл., 01.12.1937</w:t>
-            </w:r>
-            <w:r>
-              <w:rPr>
-                <w:rFonts w:ascii="Arial" w:hAnsi="Arial" w:cs="Arial"/>
-                <w:sz w:val="16"/>
-                <w:szCs w:val="16"/>
-                <w:lang w:val="ru-RU"/>
-              </w:rPr>
-              <w:t xml:space="preserve"> – </w:t>
-            </w:r>
-            <w:r>
-              <w:rPr>
-                <w:rFonts w:ascii="Arial" w:hAnsi="Arial" w:cs="Arial"/>
-                <w:sz w:val="16"/>
-                <w:szCs w:val="16"/>
-                <w:lang w:val="ru-RU"/>
-              </w:rPr>
-              <w:t>ВМН. Расстреляна 01.01.1938. Реабилитация: военным трибуналом ЗабВО., 18.04.1958. Состав семьи: Незамужная</w:t>
-            </w:r>
+              <w:t xml:space="preserve">1900 г.р., </w:t>
+            </w:r>
+            <w:proofErr w:type="spellStart"/>
+            <w:r>
+              <w:rPr>
+                <w:rFonts w:ascii="Arial" w:hAnsi="Arial" w:cs="Arial"/>
+                <w:sz w:val="16"/>
+                <w:szCs w:val="16"/>
+                <w:lang w:val="ru-RU"/>
+              </w:rPr>
+              <w:t>м.р</w:t>
+            </w:r>
+            <w:proofErr w:type="spellEnd"/>
+            <w:r>
+              <w:rPr>
+                <w:rFonts w:ascii="Arial" w:hAnsi="Arial" w:cs="Arial"/>
+                <w:sz w:val="16"/>
+                <w:szCs w:val="16"/>
+                <w:lang w:val="ru-RU"/>
+              </w:rPr>
+              <w:t xml:space="preserve">.: Забайкальская обл., Читинский уезд, с. </w:t>
+            </w:r>
+            <w:proofErr w:type="spellStart"/>
+            <w:r>
+              <w:rPr>
+                <w:rFonts w:ascii="Arial" w:hAnsi="Arial" w:cs="Arial"/>
+                <w:sz w:val="16"/>
+                <w:szCs w:val="16"/>
+                <w:lang w:val="ru-RU"/>
+              </w:rPr>
+              <w:t>Уронай</w:t>
+            </w:r>
+            <w:proofErr w:type="spellEnd"/>
+            <w:r>
+              <w:rPr>
+                <w:rFonts w:ascii="Arial" w:hAnsi="Arial" w:cs="Arial"/>
+                <w:sz w:val="16"/>
+                <w:szCs w:val="16"/>
+                <w:lang w:val="ru-RU"/>
+              </w:rPr>
+              <w:t xml:space="preserve">, бурятка. </w:t>
+            </w:r>
+            <w:proofErr w:type="spellStart"/>
+            <w:r>
+              <w:rPr>
+                <w:rFonts w:ascii="Arial" w:hAnsi="Arial" w:cs="Arial"/>
+                <w:sz w:val="16"/>
+                <w:szCs w:val="16"/>
+                <w:lang w:val="ru-RU"/>
+              </w:rPr>
+              <w:t>БОЗ.прож</w:t>
+            </w:r>
+            <w:proofErr w:type="spellEnd"/>
+            <w:r>
+              <w:rPr>
+                <w:rFonts w:ascii="Arial" w:hAnsi="Arial" w:cs="Arial"/>
+                <w:sz w:val="16"/>
+                <w:szCs w:val="16"/>
+                <w:lang w:val="ru-RU"/>
+              </w:rPr>
+              <w:t xml:space="preserve">.: Читинская обл., Шилкинский р-н, ст. Холбон, арестована 12.10.1937. Обвинение: по ст. 58-1а, </w:t>
+            </w:r>
+            <w:proofErr w:type="gramStart"/>
+            <w:r>
+              <w:rPr>
+                <w:rFonts w:ascii="Arial" w:hAnsi="Arial" w:cs="Arial"/>
+                <w:sz w:val="16"/>
+                <w:szCs w:val="16"/>
+                <w:lang w:val="ru-RU"/>
+              </w:rPr>
+              <w:t>58-9</w:t>
+            </w:r>
+            <w:proofErr w:type="gramEnd"/>
+            <w:r>
+              <w:rPr>
+                <w:rFonts w:ascii="Arial" w:hAnsi="Arial" w:cs="Arial"/>
+                <w:sz w:val="16"/>
+                <w:szCs w:val="16"/>
+                <w:lang w:val="ru-RU"/>
+              </w:rPr>
+              <w:t xml:space="preserve">, </w:t>
+            </w:r>
+            <w:proofErr w:type="gramStart"/>
+            <w:r>
+              <w:rPr>
+                <w:rFonts w:ascii="Arial" w:hAnsi="Arial" w:cs="Arial"/>
+                <w:sz w:val="16"/>
+                <w:szCs w:val="16"/>
+                <w:lang w:val="ru-RU"/>
+              </w:rPr>
+              <w:t>58-11</w:t>
+            </w:r>
+            <w:proofErr w:type="gramEnd"/>
+            <w:r>
+              <w:rPr>
+                <w:rFonts w:ascii="Arial" w:hAnsi="Arial" w:cs="Arial"/>
+                <w:sz w:val="16"/>
+                <w:szCs w:val="16"/>
+                <w:lang w:val="ru-RU"/>
+              </w:rPr>
+              <w:t xml:space="preserve"> УК </w:t>
+            </w:r>
+            <w:proofErr w:type="spellStart"/>
+            <w:r>
+              <w:rPr>
+                <w:rFonts w:ascii="Arial" w:hAnsi="Arial" w:cs="Arial"/>
+                <w:sz w:val="16"/>
+                <w:szCs w:val="16"/>
+                <w:lang w:val="ru-RU"/>
+              </w:rPr>
+              <w:t>РСФСР.Приговор</w:t>
+            </w:r>
+            <w:proofErr w:type="spellEnd"/>
+            <w:r>
+              <w:rPr>
+                <w:rFonts w:ascii="Arial" w:hAnsi="Arial" w:cs="Arial"/>
+                <w:sz w:val="16"/>
+                <w:szCs w:val="16"/>
+                <w:lang w:val="ru-RU"/>
+              </w:rPr>
+              <w:t xml:space="preserve">: Тройкой УНКВД по Читинской обл., 01.12.1937 – ВМН. Расстреляна 01.01.1938. Реабилитация: военным трибуналом ЗабВО., 18.04.1958. Состав семьи: </w:t>
+            </w:r>
+            <w:proofErr w:type="spellStart"/>
+            <w:r>
+              <w:rPr>
+                <w:rFonts w:ascii="Arial" w:hAnsi="Arial" w:cs="Arial"/>
+                <w:sz w:val="16"/>
+                <w:szCs w:val="16"/>
+                <w:lang w:val="ru-RU"/>
+              </w:rPr>
+              <w:t>Незамужная</w:t>
+            </w:r>
+            <w:proofErr w:type="spellEnd"/>
           </w:p>
           <w:p>
             <w:pPr>
@@ -1015,40 +1146,7 @@
                 <w:szCs w:val="16"/>
                 <w:lang w:val="ru-RU"/>
               </w:rPr>
-              <w:t>Источник: Книга памяти Читинской обл.</w:t>
-            </w:r>
-            <w:r>
-              <w:rPr>
-                <w:rFonts w:ascii="Arial" w:hAnsi="Arial" w:cs="Arial"/>
-                <w:b/>
-                <w:bCs/>
-                <w:sz w:val="16"/>
-                <w:szCs w:val="16"/>
-                <w:lang w:val="ru-RU"/>
-              </w:rPr>
-              <w:t>,</w:t>
-            </w:r>
-            <w:r>
-              <w:rPr>
-                <w:rFonts w:ascii="Arial" w:hAnsi="Arial" w:cs="Arial"/>
-                <w:b/>
-                <w:bCs/>
-                <w:sz w:val="16"/>
-                <w:szCs w:val="16"/>
-                <w:lang w:val="ru-RU"/>
-              </w:rPr>
-              <w:t xml:space="preserve"> т.2</w:t>
-            </w:r>
-            <w:r>
-              <w:rPr>
-                <w:rFonts w:ascii="Arial" w:hAnsi="Arial" w:cs="Arial"/>
-                <w:b/>
-                <w:bCs/>
-                <w:sz w:val="16"/>
-                <w:szCs w:val="16"/>
-                <w:lang w:val="ru-RU"/>
-              </w:rPr>
-              <w:t>;</w:t>
+              <w:t>Источник: Книга памяти Читинской обл., т.2;</w:t>
             </w:r>
             <w:r>
               <w:rPr>
@@ -1059,7 +1157,7 @@
               </w:rPr>
               <w:t xml:space="preserve"> </w:t>
             </w:r>
-            <w:hyperlink r:id="rId9" w:history="1">
+            <w:hyperlink r:id="rId8" w:history="1">
               <w:r>
                 <w:rPr>
                   <w:rStyle w:val="Hyperlink"/>
@@ -1099,23 +1197,62 @@
                 <w:lang w:val="ru-RU"/>
               </w:rPr>
             </w:pPr>
-            <w:hyperlink r:id="rId10" w:history="1">
-              <w:r>
-                <w:rPr>
-                  <w:rStyle w:val="Hyperlink"/>
-                  <w:rFonts w:ascii="Arial" w:hAnsi="Arial" w:cs="Arial"/>
-                  <w:b/>
-                  <w:bCs/>
-                  <w:color w:val="auto"/>
-                  <w:sz w:val="16"/>
-                  <w:szCs w:val="16"/>
-                  <w:bdr w:val="none" w:sz="0" w:space="0" w:color="auto" w:frame="1"/>
-                  <w:shd w:val="clear" w:color="auto" w:fill="FFFFFF"/>
-                  <w:lang w:val="ru-RU"/>
-                </w:rPr>
-                <w:t>Банзарова Сыбжит Цыбыковна</w:t>
-              </w:r>
-            </w:hyperlink>
+            <w:r>
+              <w:rPr>
+                <w:rFonts w:ascii="Arial" w:hAnsi="Arial" w:cs="Arial"/>
+                <w:b/>
+                <w:bCs/>
+                <w:sz w:val="16"/>
+                <w:szCs w:val="16"/>
+                <w:bdr w:val="none" w:sz="0" w:space="0" w:color="auto" w:frame="1"/>
+                <w:shd w:val="clear" w:color="auto" w:fill="FFFFFF"/>
+                <w:lang w:val="ru-RU"/>
+              </w:rPr>
+              <w:t xml:space="preserve">Банзарова </w:t>
+            </w:r>
+            <w:proofErr w:type="spellStart"/>
+            <w:r>
+              <w:rPr>
+                <w:rFonts w:ascii="Arial" w:hAnsi="Arial" w:cs="Arial"/>
+                <w:b/>
+                <w:bCs/>
+                <w:sz w:val="16"/>
+                <w:szCs w:val="16"/>
+                <w:bdr w:val="none" w:sz="0" w:space="0" w:color="auto" w:frame="1"/>
+                <w:shd w:val="clear" w:color="auto" w:fill="FFFFFF"/>
+                <w:lang w:val="ru-RU"/>
+              </w:rPr>
+              <w:t>Сыбжит</w:t>
+            </w:r>
+            <w:proofErr w:type="spellEnd"/>
+            <w:r>
+              <w:rPr>
+                <w:rFonts w:ascii="Arial" w:hAnsi="Arial" w:cs="Arial"/>
+                <w:b/>
+                <w:bCs/>
+                <w:sz w:val="16"/>
+                <w:szCs w:val="16"/>
+                <w:bdr w:val="none" w:sz="0" w:space="0" w:color="auto" w:frame="1"/>
+                <w:shd w:val="clear" w:color="auto" w:fill="FFFFFF"/>
+                <w:lang w:val="ru-RU"/>
+              </w:rPr>
+              <w:t xml:space="preserve"> </w:t>
+            </w:r>
+            <w:proofErr w:type="spellStart"/>
+            <w:r>
+              <w:rPr>
+                <w:rFonts w:ascii="Arial" w:hAnsi="Arial" w:cs="Arial"/>
+                <w:b/>
+                <w:bCs/>
+                <w:sz w:val="16"/>
+                <w:szCs w:val="16"/>
+                <w:bdr w:val="none" w:sz="0" w:space="0" w:color="auto" w:frame="1"/>
+                <w:shd w:val="clear" w:color="auto" w:fill="FFFFFF"/>
+                <w:lang w:val="ru-RU"/>
+              </w:rPr>
+              <w:t>Цыбыковна</w:t>
+            </w:r>
+            <w:proofErr w:type="spellEnd"/>
             <w:r>
               <w:rPr>
                 <w:rStyle w:val="Hyperlink"/>
@@ -1130,39 +1267,7 @@
                 <w:shd w:val="clear" w:color="auto" w:fill="FFFFFF"/>
                 <w:lang w:val="ru-RU"/>
               </w:rPr>
-              <w:t xml:space="preserve"> </w:t>
-            </w:r>
-            <w:r>
-              <w:rPr>
-                <w:rStyle w:val="Hyperlink"/>
-                <w:rFonts w:ascii="Arial" w:hAnsi="Arial" w:cs="Arial"/>
-                <w:b/>
-                <w:bCs/>
-                <w:color w:val="auto"/>
-                <w:sz w:val="16"/>
-                <w:szCs w:val="16"/>
-                <w:u w:val="none"/>
-                <w:bdr w:val="none" w:sz="0" w:space="0" w:color="auto" w:frame="1"/>
-                <w:shd w:val="clear" w:color="auto" w:fill="FFFFFF"/>
-                <w:lang w:val="ru-RU"/>
-              </w:rPr>
-              <w:t>66 лет</w:t>
-            </w:r>
-            <w:r>
-              <w:rPr>
-                <w:rStyle w:val="Hyperlink"/>
-                <w:rFonts w:ascii="Arial" w:hAnsi="Arial" w:cs="Arial"/>
-                <w:b/>
-                <w:bCs/>
-                <w:color w:val="auto"/>
-                <w:sz w:val="16"/>
-                <w:szCs w:val="16"/>
-                <w:u w:val="none"/>
-                <w:bdr w:val="none" w:sz="0" w:space="0" w:color="auto" w:frame="1"/>
-                <w:shd w:val="clear" w:color="auto" w:fill="FFFFFF"/>
-                <w:lang w:val="ru-RU"/>
-              </w:rPr>
-              <w:t xml:space="preserve"> </w:t>
+              <w:t xml:space="preserve"> 66 лет </w:t>
             </w:r>
           </w:p>
           <w:p>
@@ -1185,79 +1290,287 @@
                 <w:szCs w:val="16"/>
                 <w:lang w:val="ru-RU"/>
               </w:rPr>
-              <w:t>1872 г.р., м.р.: Забайкальская обл., Верхнеудинский уезд, с. Бурсомон, бурятка, домохозяйка, прож.: Читинская обл., Красночикойский р-н, с. Бурсомон, арестована 14.01.1938. Обвинение: по ст. 58-1а, 58-7, 58-10, 58-11 УК РСФСР. Приговор: Тройкой УНКВД по Читинской обл., 13.02.1938</w:t>
-            </w:r>
-            <w:r>
-              <w:rPr>
-                <w:rFonts w:ascii="Arial" w:hAnsi="Arial" w:cs="Arial"/>
-                <w:sz w:val="16"/>
-                <w:szCs w:val="16"/>
-                <w:lang w:val="ru-RU"/>
-              </w:rPr>
-              <w:t xml:space="preserve"> – </w:t>
-            </w:r>
-            <w:r>
-              <w:rPr>
-                <w:rFonts w:ascii="Arial" w:hAnsi="Arial" w:cs="Arial"/>
-                <w:sz w:val="16"/>
-                <w:szCs w:val="16"/>
-                <w:lang w:val="ru-RU"/>
-              </w:rPr>
-              <w:t>ВМН. Расстреляна 11.03.1938. Реабилитация: военным трибуналом ЗабВО., 31.12.1957. Состав семьи: Вдова, дети: Банзаров Доржой</w:t>
-            </w:r>
-            <w:r>
-              <w:rPr>
-                <w:rFonts w:ascii="Arial" w:hAnsi="Arial" w:cs="Arial"/>
-                <w:sz w:val="16"/>
-                <w:szCs w:val="16"/>
-                <w:lang w:val="ru-RU"/>
-              </w:rPr>
-              <w:t xml:space="preserve"> – </w:t>
-            </w:r>
-            <w:r>
-              <w:rPr>
-                <w:rFonts w:ascii="Arial" w:hAnsi="Arial" w:cs="Arial"/>
-                <w:sz w:val="16"/>
-                <w:szCs w:val="16"/>
-                <w:lang w:val="ru-RU"/>
-              </w:rPr>
-              <w:t>1889, Батухай</w:t>
-            </w:r>
-            <w:r>
-              <w:rPr>
-                <w:rFonts w:ascii="Arial" w:hAnsi="Arial" w:cs="Arial"/>
-                <w:sz w:val="16"/>
-                <w:szCs w:val="16"/>
-                <w:lang w:val="ru-RU"/>
-              </w:rPr>
-              <w:t xml:space="preserve"> – </w:t>
-            </w:r>
-            <w:r>
-              <w:rPr>
-                <w:rFonts w:ascii="Arial" w:hAnsi="Arial" w:cs="Arial"/>
-                <w:sz w:val="16"/>
-                <w:szCs w:val="16"/>
-                <w:lang w:val="ru-RU"/>
-              </w:rPr>
-              <w:t>1911, Арага, Долма</w:t>
-            </w:r>
-            <w:r>
-              <w:rPr>
-                <w:rFonts w:ascii="Arial" w:hAnsi="Arial" w:cs="Arial"/>
-                <w:sz w:val="16"/>
-                <w:szCs w:val="16"/>
-                <w:lang w:val="ru-RU"/>
-              </w:rPr>
-              <w:t xml:space="preserve"> – </w:t>
-            </w:r>
-            <w:r>
-              <w:rPr>
-                <w:rFonts w:ascii="Arial" w:hAnsi="Arial" w:cs="Arial"/>
-                <w:sz w:val="16"/>
-                <w:szCs w:val="16"/>
-                <w:lang w:val="ru-RU"/>
-              </w:rPr>
-              <w:t>40.</w:t>
+              <w:t xml:space="preserve">1872 г.р., </w:t>
+            </w:r>
+            <w:proofErr w:type="spellStart"/>
+            <w:r>
+              <w:rPr>
+                <w:rFonts w:ascii="Arial" w:hAnsi="Arial" w:cs="Arial"/>
+                <w:sz w:val="16"/>
+                <w:szCs w:val="16"/>
+                <w:lang w:val="ru-RU"/>
+              </w:rPr>
+              <w:t>м.р</w:t>
+            </w:r>
+            <w:proofErr w:type="spellEnd"/>
+            <w:r>
+              <w:rPr>
+                <w:rFonts w:ascii="Arial" w:hAnsi="Arial" w:cs="Arial"/>
+                <w:sz w:val="16"/>
+                <w:szCs w:val="16"/>
+                <w:lang w:val="ru-RU"/>
+              </w:rPr>
+              <w:t xml:space="preserve">.: Забайкальская обл., </w:t>
+            </w:r>
+            <w:proofErr w:type="spellStart"/>
+            <w:r>
+              <w:rPr>
+                <w:rFonts w:ascii="Arial" w:hAnsi="Arial" w:cs="Arial"/>
+                <w:sz w:val="16"/>
+                <w:szCs w:val="16"/>
+                <w:lang w:val="ru-RU"/>
+              </w:rPr>
+              <w:t>Верхнеудинский</w:t>
+            </w:r>
+            <w:proofErr w:type="spellEnd"/>
+            <w:r>
+              <w:rPr>
+                <w:rFonts w:ascii="Arial" w:hAnsi="Arial" w:cs="Arial"/>
+                <w:sz w:val="16"/>
+                <w:szCs w:val="16"/>
+                <w:lang w:val="ru-RU"/>
+              </w:rPr>
+              <w:t xml:space="preserve"> уезд, с. </w:t>
+            </w:r>
+            <w:proofErr w:type="spellStart"/>
+            <w:r>
+              <w:rPr>
+                <w:rFonts w:ascii="Arial" w:hAnsi="Arial" w:cs="Arial"/>
+                <w:sz w:val="16"/>
+                <w:szCs w:val="16"/>
+                <w:lang w:val="ru-RU"/>
+              </w:rPr>
+              <w:t>Бурсомон</w:t>
+            </w:r>
+            <w:proofErr w:type="spellEnd"/>
+            <w:r>
+              <w:rPr>
+                <w:rFonts w:ascii="Arial" w:hAnsi="Arial" w:cs="Arial"/>
+                <w:sz w:val="16"/>
+                <w:szCs w:val="16"/>
+                <w:lang w:val="ru-RU"/>
+              </w:rPr>
+              <w:t xml:space="preserve">, бурятка, домохозяйка, </w:t>
+            </w:r>
+            <w:proofErr w:type="spellStart"/>
+            <w:r>
+              <w:rPr>
+                <w:rFonts w:ascii="Arial" w:hAnsi="Arial" w:cs="Arial"/>
+                <w:sz w:val="16"/>
+                <w:szCs w:val="16"/>
+                <w:lang w:val="ru-RU"/>
+              </w:rPr>
+              <w:t>прож</w:t>
+            </w:r>
+            <w:proofErr w:type="spellEnd"/>
+            <w:r>
+              <w:rPr>
+                <w:rFonts w:ascii="Arial" w:hAnsi="Arial" w:cs="Arial"/>
+                <w:sz w:val="16"/>
+                <w:szCs w:val="16"/>
+                <w:lang w:val="ru-RU"/>
+              </w:rPr>
+              <w:t xml:space="preserve">.: Читинская обл., Красночикойский р-н, с. </w:t>
+            </w:r>
+            <w:proofErr w:type="spellStart"/>
+            <w:r>
+              <w:rPr>
+                <w:rFonts w:ascii="Arial" w:hAnsi="Arial" w:cs="Arial"/>
+                <w:sz w:val="16"/>
+                <w:szCs w:val="16"/>
+                <w:lang w:val="ru-RU"/>
+              </w:rPr>
+              <w:t>Бурсомон</w:t>
+            </w:r>
+            <w:proofErr w:type="spellEnd"/>
+            <w:r>
+              <w:rPr>
+                <w:rFonts w:ascii="Arial" w:hAnsi="Arial" w:cs="Arial"/>
+                <w:sz w:val="16"/>
+                <w:szCs w:val="16"/>
+                <w:lang w:val="ru-RU"/>
+              </w:rPr>
+              <w:t xml:space="preserve">, арестована 14.01.1938. Обвинение: по ст. 58-1а, </w:t>
+            </w:r>
+            <w:proofErr w:type="gramStart"/>
+            <w:r>
+              <w:rPr>
+                <w:rFonts w:ascii="Arial" w:hAnsi="Arial" w:cs="Arial"/>
+                <w:sz w:val="16"/>
+                <w:szCs w:val="16"/>
+                <w:lang w:val="ru-RU"/>
+              </w:rPr>
+              <w:t>58-7</w:t>
+            </w:r>
+            <w:proofErr w:type="gramEnd"/>
+            <w:r>
+              <w:rPr>
+                <w:rFonts w:ascii="Arial" w:hAnsi="Arial" w:cs="Arial"/>
+                <w:sz w:val="16"/>
+                <w:szCs w:val="16"/>
+                <w:lang w:val="ru-RU"/>
+              </w:rPr>
+              <w:t xml:space="preserve">, </w:t>
+            </w:r>
+            <w:proofErr w:type="gramStart"/>
+            <w:r>
+              <w:rPr>
+                <w:rFonts w:ascii="Arial" w:hAnsi="Arial" w:cs="Arial"/>
+                <w:sz w:val="16"/>
+                <w:szCs w:val="16"/>
+                <w:lang w:val="ru-RU"/>
+              </w:rPr>
+              <w:t>58-10</w:t>
+            </w:r>
+            <w:proofErr w:type="gramEnd"/>
+            <w:r>
+              <w:rPr>
+                <w:rFonts w:ascii="Arial" w:hAnsi="Arial" w:cs="Arial"/>
+                <w:sz w:val="16"/>
+                <w:szCs w:val="16"/>
+                <w:lang w:val="ru-RU"/>
+              </w:rPr>
+              <w:t xml:space="preserve">, </w:t>
+            </w:r>
+            <w:proofErr w:type="gramStart"/>
+            <w:r>
+              <w:rPr>
+                <w:rFonts w:ascii="Arial" w:hAnsi="Arial" w:cs="Arial"/>
+                <w:sz w:val="16"/>
+                <w:szCs w:val="16"/>
+                <w:lang w:val="ru-RU"/>
+              </w:rPr>
+              <w:t>58-11</w:t>
+            </w:r>
+            <w:proofErr w:type="gramEnd"/>
+            <w:r>
+              <w:rPr>
+                <w:rFonts w:ascii="Arial" w:hAnsi="Arial" w:cs="Arial"/>
+                <w:sz w:val="16"/>
+                <w:szCs w:val="16"/>
+                <w:lang w:val="ru-RU"/>
+              </w:rPr>
+              <w:t xml:space="preserve"> УК РСФСР. Приговор: Тройкой УНКВД по Читинской обл., 13.02.1938 </w:t>
+            </w:r>
+            <w:r>
+              <w:rPr>
+                <w:rFonts w:ascii="Arial" w:hAnsi="Arial" w:cs="Arial"/>
+                <w:sz w:val="16"/>
+                <w:szCs w:val="16"/>
+                <w:lang w:val="ru-RU"/>
+              </w:rPr>
+              <w:lastRenderedPageBreak/>
+              <w:t xml:space="preserve">– ВМН. Расстреляна 11.03.1938. Реабилитация: военным трибуналом ЗабВО., 31.12.1957. (одновременно расстреляны двое ее сыновей:  </w:t>
+            </w:r>
+            <w:hyperlink r:id="rId9" w:history="1">
+              <w:r>
+                <w:rPr>
+                  <w:rStyle w:val="Hyperlink"/>
+                  <w:rFonts w:ascii="Arial" w:hAnsi="Arial" w:cs="Arial"/>
+                  <w:sz w:val="16"/>
+                  <w:szCs w:val="16"/>
+                  <w:lang w:val="ru-RU"/>
+                </w:rPr>
+                <w:t xml:space="preserve">Банзаров </w:t>
+              </w:r>
+              <w:proofErr w:type="spellStart"/>
+              <w:r>
+                <w:rPr>
+                  <w:rStyle w:val="Hyperlink"/>
+                  <w:rFonts w:ascii="Arial" w:hAnsi="Arial" w:cs="Arial"/>
+                  <w:sz w:val="16"/>
+                  <w:szCs w:val="16"/>
+                  <w:lang w:val="ru-RU"/>
+                </w:rPr>
+                <w:t>Доржей</w:t>
+              </w:r>
+              <w:proofErr w:type="spellEnd"/>
+              <w:r>
+                <w:rPr>
+                  <w:rStyle w:val="Hyperlink"/>
+                  <w:rFonts w:ascii="Arial" w:hAnsi="Arial" w:cs="Arial"/>
+                  <w:sz w:val="16"/>
+                  <w:szCs w:val="16"/>
+                  <w:lang w:val="ru-RU"/>
+                </w:rPr>
+                <w:t xml:space="preserve"> </w:t>
+              </w:r>
+              <w:proofErr w:type="spellStart"/>
+              <w:r>
+                <w:rPr>
+                  <w:rStyle w:val="Hyperlink"/>
+                  <w:rFonts w:ascii="Arial" w:hAnsi="Arial" w:cs="Arial"/>
+                  <w:sz w:val="16"/>
+                  <w:szCs w:val="16"/>
+                  <w:lang w:val="ru-RU"/>
+                </w:rPr>
+                <w:t>Лубсанович</w:t>
+              </w:r>
+              <w:proofErr w:type="spellEnd"/>
+            </w:hyperlink>
+            <w:r>
+              <w:rPr>
+                <w:rFonts w:ascii="Arial" w:hAnsi="Arial" w:cs="Arial"/>
+                <w:sz w:val="16"/>
+                <w:szCs w:val="16"/>
+                <w:lang w:val="ru-RU"/>
+              </w:rPr>
+              <w:t xml:space="preserve"> 1889 г.р., и  </w:t>
+            </w:r>
+            <w:hyperlink r:id="rId10" w:history="1">
+              <w:r>
+                <w:rPr>
+                  <w:rStyle w:val="Hyperlink"/>
+                  <w:rFonts w:ascii="Arial" w:hAnsi="Arial" w:cs="Arial"/>
+                  <w:sz w:val="16"/>
+                  <w:szCs w:val="16"/>
+                  <w:lang w:val="ru-RU"/>
+                </w:rPr>
+                <w:t xml:space="preserve">Банзаров </w:t>
+              </w:r>
+              <w:proofErr w:type="spellStart"/>
+              <w:r>
+                <w:rPr>
+                  <w:rStyle w:val="Hyperlink"/>
+                  <w:rFonts w:ascii="Arial" w:hAnsi="Arial" w:cs="Arial"/>
+                  <w:sz w:val="16"/>
+                  <w:szCs w:val="16"/>
+                  <w:lang w:val="ru-RU"/>
+                </w:rPr>
+                <w:t>Батухай</w:t>
+              </w:r>
+              <w:proofErr w:type="spellEnd"/>
+              <w:r>
+                <w:rPr>
+                  <w:rStyle w:val="Hyperlink"/>
+                  <w:rFonts w:ascii="Arial" w:hAnsi="Arial" w:cs="Arial"/>
+                  <w:sz w:val="16"/>
+                  <w:szCs w:val="16"/>
+                  <w:lang w:val="ru-RU"/>
+                </w:rPr>
+                <w:t xml:space="preserve"> </w:t>
+              </w:r>
+              <w:proofErr w:type="spellStart"/>
+              <w:r>
+                <w:rPr>
+                  <w:rStyle w:val="Hyperlink"/>
+                  <w:rFonts w:ascii="Arial" w:hAnsi="Arial" w:cs="Arial"/>
+                  <w:sz w:val="16"/>
+                  <w:szCs w:val="16"/>
+                  <w:lang w:val="ru-RU"/>
+                </w:rPr>
+                <w:t>Садоевич</w:t>
+              </w:r>
+              <w:proofErr w:type="spellEnd"/>
+            </w:hyperlink>
+            <w:r>
+              <w:rPr>
+                <w:rFonts w:ascii="Arial" w:hAnsi="Arial" w:cs="Arial"/>
+                <w:sz w:val="16"/>
+                <w:szCs w:val="16"/>
+                <w:lang w:val="ru-RU"/>
+              </w:rPr>
+              <w:t xml:space="preserve"> 1911 г.р.) </w:t>
             </w:r>
           </w:p>
           <w:p>
@@ -1282,40 +1595,7 @@
                 <w:szCs w:val="16"/>
                 <w:lang w:val="ru-RU"/>
               </w:rPr>
-              <w:t>Источник: Книга памяти Читинской обл.</w:t>
-            </w:r>
-            <w:r>
-              <w:rPr>
-                <w:rFonts w:ascii="Arial" w:hAnsi="Arial" w:cs="Arial"/>
-                <w:b/>
-                <w:bCs/>
-                <w:sz w:val="16"/>
-                <w:szCs w:val="16"/>
-                <w:lang w:val="ru-RU"/>
-              </w:rPr>
-              <w:t>,</w:t>
-            </w:r>
-            <w:r>
-              <w:rPr>
-                <w:rFonts w:ascii="Arial" w:hAnsi="Arial" w:cs="Arial"/>
-                <w:b/>
-                <w:bCs/>
-                <w:sz w:val="16"/>
-                <w:szCs w:val="16"/>
-                <w:lang w:val="ru-RU"/>
-              </w:rPr>
-              <w:t xml:space="preserve"> т.2</w:t>
-            </w:r>
-            <w:r>
-              <w:rPr>
-                <w:rFonts w:ascii="Arial" w:hAnsi="Arial" w:cs="Arial"/>
-                <w:b/>
-                <w:bCs/>
-                <w:sz w:val="16"/>
-                <w:szCs w:val="16"/>
-                <w:lang w:val="ru-RU"/>
-              </w:rPr>
-              <w:t>;</w:t>
+              <w:t>Источник: Книга памяти Читинской обл., т.2;</w:t>
             </w:r>
             <w:r>
               <w:rPr>
@@ -1368,6 +1648,7 @@
                 <w:lang w:val="ru-RU"/>
               </w:rPr>
             </w:pPr>
+            <w:proofErr w:type="spellStart"/>
             <w:r>
               <w:rPr>
                 <w:rFonts w:ascii="Arial" w:hAnsi="Arial" w:cs="Arial"/>
@@ -1377,8 +1658,10 @@
                 <w:szCs w:val="16"/>
                 <w:lang w:val="ru-RU"/>
               </w:rPr>
-              <w:t>Галсанова Долгор Жалсановна</w:t>
-            </w:r>
+              <w:lastRenderedPageBreak/>
+              <w:t>Галсанова</w:t>
+            </w:r>
+            <w:proofErr w:type="spellEnd"/>
             <w:r>
               <w:rPr>
                 <w:rFonts w:ascii="Arial" w:hAnsi="Arial" w:cs="Arial"/>
@@ -1390,6 +1673,7 @@
               </w:rPr>
               <w:t xml:space="preserve"> </w:t>
             </w:r>
+            <w:proofErr w:type="spellStart"/>
             <w:r>
               <w:rPr>
                 <w:rFonts w:ascii="Arial" w:hAnsi="Arial" w:cs="Arial"/>
@@ -1399,8 +1683,9 @@
                 <w:szCs w:val="16"/>
                 <w:lang w:val="ru-RU"/>
               </w:rPr>
-              <w:t>48 лет</w:t>
-            </w:r>
+              <w:t>Долгор</w:t>
+            </w:r>
+            <w:proofErr w:type="spellEnd"/>
             <w:r>
               <w:rPr>
                 <w:rFonts w:ascii="Arial" w:hAnsi="Arial" w:cs="Arial"/>
@@ -1411,6 +1696,30 @@
                 <w:lang w:val="ru-RU"/>
               </w:rPr>
               <w:t xml:space="preserve"> </w:t>
+            </w:r>
+            <w:proofErr w:type="spellStart"/>
+            <w:r>
+              <w:rPr>
+                <w:rFonts w:ascii="Arial" w:hAnsi="Arial" w:cs="Arial"/>
+                <w:b/>
+                <w:bCs/>
+                <w:sz w:val="16"/>
+                <w:szCs w:val="16"/>
+                <w:lang w:val="ru-RU"/>
+              </w:rPr>
+              <w:t>Жалсановна</w:t>
+            </w:r>
+            <w:proofErr w:type="spellEnd"/>
+            <w:r>
+              <w:rPr>
+                <w:rFonts w:ascii="Arial" w:hAnsi="Arial" w:cs="Arial"/>
+                <w:b/>
+                <w:bCs/>
+                <w:sz w:val="16"/>
+                <w:szCs w:val="16"/>
+                <w:lang w:val="ru-RU"/>
+              </w:rPr>
+              <w:t xml:space="preserve"> 48 лет </w:t>
             </w:r>
           </w:p>
           <w:p>
@@ -1430,26 +1739,67 @@
                 <w:szCs w:val="16"/>
                 <w:lang w:val="ru-RU"/>
               </w:rPr>
-              <w:lastRenderedPageBreak/>
-              <w:t>1889 г.р., м.р.: БМАССР, Тункинский район, Шарза, прож.: там же,</w:t>
-            </w:r>
-            <w:r>
-              <w:rPr>
-                <w:rFonts w:ascii="Arial" w:hAnsi="Arial" w:cs="Arial"/>
-                <w:sz w:val="16"/>
-                <w:szCs w:val="16"/>
-                <w:lang w:val="ru-RU"/>
-              </w:rPr>
-              <w:t xml:space="preserve"> </w:t>
-            </w:r>
-            <w:r>
-              <w:rPr>
-                <w:rFonts w:ascii="Arial" w:hAnsi="Arial" w:cs="Arial"/>
-                <w:sz w:val="16"/>
-                <w:szCs w:val="16"/>
-                <w:lang w:val="ru-RU"/>
-              </w:rPr>
-              <w:t>бурятка, образование: малограмотная, арестована: 29 сентября 1937 г.</w:t>
+              <w:t xml:space="preserve">1889 г.р., </w:t>
+            </w:r>
+            <w:proofErr w:type="spellStart"/>
+            <w:r>
+              <w:rPr>
+                <w:rFonts w:ascii="Arial" w:hAnsi="Arial" w:cs="Arial"/>
+                <w:sz w:val="16"/>
+                <w:szCs w:val="16"/>
+                <w:lang w:val="ru-RU"/>
+              </w:rPr>
+              <w:t>м.р</w:t>
+            </w:r>
+            <w:proofErr w:type="spellEnd"/>
+            <w:r>
+              <w:rPr>
+                <w:rFonts w:ascii="Arial" w:hAnsi="Arial" w:cs="Arial"/>
+                <w:sz w:val="16"/>
+                <w:szCs w:val="16"/>
+                <w:lang w:val="ru-RU"/>
+              </w:rPr>
+              <w:t xml:space="preserve">.: БМАССР, Тункинский район, </w:t>
+            </w:r>
+            <w:proofErr w:type="spellStart"/>
+            <w:r>
+              <w:rPr>
+                <w:rFonts w:ascii="Arial" w:hAnsi="Arial" w:cs="Arial"/>
+                <w:sz w:val="16"/>
+                <w:szCs w:val="16"/>
+                <w:lang w:val="ru-RU"/>
+              </w:rPr>
+              <w:t>Шарза</w:t>
+            </w:r>
+            <w:proofErr w:type="spellEnd"/>
+            <w:r>
+              <w:rPr>
+                <w:rFonts w:ascii="Arial" w:hAnsi="Arial" w:cs="Arial"/>
+                <w:sz w:val="16"/>
+                <w:szCs w:val="16"/>
+                <w:lang w:val="ru-RU"/>
+              </w:rPr>
+              <w:t xml:space="preserve">, </w:t>
+            </w:r>
+            <w:proofErr w:type="spellStart"/>
+            <w:r>
+              <w:rPr>
+                <w:rFonts w:ascii="Arial" w:hAnsi="Arial" w:cs="Arial"/>
+                <w:sz w:val="16"/>
+                <w:szCs w:val="16"/>
+                <w:lang w:val="ru-RU"/>
+              </w:rPr>
+              <w:t>прож</w:t>
+            </w:r>
+            <w:proofErr w:type="spellEnd"/>
+            <w:r>
+              <w:rPr>
+                <w:rFonts w:ascii="Arial" w:hAnsi="Arial" w:cs="Arial"/>
+                <w:sz w:val="16"/>
+                <w:szCs w:val="16"/>
+                <w:lang w:val="ru-RU"/>
+              </w:rPr>
+              <w:t>.: там же, бурятка, образование: малограмотная, арестована: 29 сентября 1937 г.</w:t>
             </w:r>
           </w:p>
           <w:p>
@@ -1469,7 +1819,47 @@
                 <w:szCs w:val="16"/>
                 <w:lang w:val="ru-RU"/>
               </w:rPr>
-              <w:t>Обвинение: 58-10, 58-11. Осуждение: 7 декабря 1937 г. Осудивший орган: Тройкой НКВД. Приговор: ВМН. Дата реабилитации: 30 июня 1992 г.</w:t>
+              <w:t xml:space="preserve">Обвинение: </w:t>
+            </w:r>
+            <w:proofErr w:type="gramStart"/>
+            <w:r>
+              <w:rPr>
+                <w:rFonts w:ascii="Arial" w:hAnsi="Arial" w:cs="Arial"/>
+                <w:sz w:val="16"/>
+                <w:szCs w:val="16"/>
+                <w:lang w:val="ru-RU"/>
+              </w:rPr>
+              <w:t>58-10</w:t>
+            </w:r>
+            <w:proofErr w:type="gramEnd"/>
+            <w:r>
+              <w:rPr>
+                <w:rFonts w:ascii="Arial" w:hAnsi="Arial" w:cs="Arial"/>
+                <w:sz w:val="16"/>
+                <w:szCs w:val="16"/>
+                <w:lang w:val="ru-RU"/>
+              </w:rPr>
+              <w:t xml:space="preserve">, </w:t>
+            </w:r>
+            <w:proofErr w:type="gramStart"/>
+            <w:r>
+              <w:rPr>
+                <w:rFonts w:ascii="Arial" w:hAnsi="Arial" w:cs="Arial"/>
+                <w:sz w:val="16"/>
+                <w:szCs w:val="16"/>
+                <w:lang w:val="ru-RU"/>
+              </w:rPr>
+              <w:t>58-11</w:t>
+            </w:r>
+            <w:proofErr w:type="gramEnd"/>
+            <w:r>
+              <w:rPr>
+                <w:rFonts w:ascii="Arial" w:hAnsi="Arial" w:cs="Arial"/>
+                <w:sz w:val="16"/>
+                <w:szCs w:val="16"/>
+                <w:lang w:val="ru-RU"/>
+              </w:rPr>
+              <w:t>. Осуждение: 7 декабря 1937 г. Осудивший орган: Тройкой НКВД. Приговор: ВМН. Дата реабилитации: 30 июня 1992 г.</w:t>
             </w:r>
           </w:p>
           <w:p>
@@ -1543,67 +1933,7 @@
                 <w:shd w:val="clear" w:color="auto" w:fill="FFFFFF"/>
                 <w:lang w:val="ru-RU"/>
               </w:rPr>
-              <w:t>БД "Жертвы политического террора в СССР";</w:t>
-            </w:r>
-            <w:r>
-              <w:rPr>
-                <w:rFonts w:ascii="Arial" w:hAnsi="Arial" w:cs="Arial"/>
-                <w:b/>
-                <w:bCs/>
-                <w:sz w:val="16"/>
-                <w:szCs w:val="16"/>
-                <w:shd w:val="clear" w:color="auto" w:fill="FFFFFF"/>
-                <w:lang w:val="ru-RU"/>
-              </w:rPr>
-              <w:t xml:space="preserve"> </w:t>
-            </w:r>
-            <w:r>
-              <w:rPr>
-                <w:rFonts w:ascii="Arial" w:hAnsi="Arial" w:cs="Arial"/>
-                <w:b/>
-                <w:bCs/>
-                <w:sz w:val="16"/>
-                <w:szCs w:val="16"/>
-                <w:shd w:val="clear" w:color="auto" w:fill="FFFFFF"/>
-                <w:lang w:val="ru-RU"/>
-              </w:rPr>
-              <w:t>т.</w:t>
-            </w:r>
-            <w:r>
-              <w:rPr>
-                <w:rFonts w:ascii="Arial" w:hAnsi="Arial" w:cs="Arial"/>
-                <w:b/>
-                <w:bCs/>
-                <w:sz w:val="16"/>
-                <w:szCs w:val="16"/>
-                <w:shd w:val="clear" w:color="auto" w:fill="FFFFFF"/>
-                <w:lang w:val="ru-RU"/>
-              </w:rPr>
-              <w:t xml:space="preserve"> </w:t>
-            </w:r>
-            <w:r>
-              <w:rPr>
-                <w:rFonts w:ascii="Arial" w:hAnsi="Arial" w:cs="Arial"/>
-                <w:b/>
-                <w:bCs/>
-                <w:sz w:val="16"/>
-                <w:szCs w:val="16"/>
-                <w:shd w:val="clear" w:color="auto" w:fill="FFFFFF"/>
-                <w:lang w:val="ru-RU"/>
-              </w:rPr>
-              <w:t>2, Книга памяти Бурятии;</w:t>
-            </w:r>
-            <w:r>
-              <w:rPr>
-                <w:rFonts w:ascii="Arial" w:hAnsi="Arial" w:cs="Arial"/>
-                <w:b/>
-                <w:bCs/>
-                <w:sz w:val="16"/>
-                <w:szCs w:val="16"/>
-                <w:shd w:val="clear" w:color="auto" w:fill="FFFFFF"/>
-                <w:lang w:val="ru-RU"/>
-              </w:rPr>
-              <w:t xml:space="preserve"> </w:t>
+              <w:t xml:space="preserve">БД "Жертвы политического террора в СССР"; т. 2, Книга памяти Бурятии; </w:t>
             </w:r>
             <w:hyperlink r:id="rId12" w:history="1">
               <w:r>
@@ -1647,23 +1977,49 @@
                 <w:lang w:val="ru-RU"/>
               </w:rPr>
             </w:pPr>
-            <w:hyperlink r:id="rId13" w:history="1">
-              <w:r>
-                <w:rPr>
-                  <w:rStyle w:val="Hyperlink"/>
-                  <w:rFonts w:ascii="Arial" w:hAnsi="Arial" w:cs="Arial"/>
-                  <w:b/>
-                  <w:bCs/>
-                  <w:color w:val="auto"/>
-                  <w:sz w:val="16"/>
-                  <w:szCs w:val="16"/>
-                  <w:bdr w:val="none" w:sz="0" w:space="0" w:color="auto" w:frame="1"/>
-                  <w:shd w:val="clear" w:color="auto" w:fill="FFFFFF"/>
-                  <w:lang w:val="ru-RU"/>
-                </w:rPr>
-                <w:t>Диятова Улбай</w:t>
-              </w:r>
-            </w:hyperlink>
+            <w:proofErr w:type="spellStart"/>
+            <w:r>
+              <w:rPr>
+                <w:rFonts w:ascii="Arial" w:hAnsi="Arial" w:cs="Arial"/>
+                <w:b/>
+                <w:bCs/>
+                <w:sz w:val="16"/>
+                <w:szCs w:val="16"/>
+                <w:bdr w:val="none" w:sz="0" w:space="0" w:color="auto" w:frame="1"/>
+                <w:shd w:val="clear" w:color="auto" w:fill="FFFFFF"/>
+                <w:lang w:val="ru-RU"/>
+              </w:rPr>
+              <w:t>Диятова</w:t>
+            </w:r>
+            <w:proofErr w:type="spellEnd"/>
+            <w:r>
+              <w:rPr>
+                <w:rFonts w:ascii="Arial" w:hAnsi="Arial" w:cs="Arial"/>
+                <w:b/>
+                <w:bCs/>
+                <w:sz w:val="16"/>
+                <w:szCs w:val="16"/>
+                <w:bdr w:val="none" w:sz="0" w:space="0" w:color="auto" w:frame="1"/>
+                <w:shd w:val="clear" w:color="auto" w:fill="FFFFFF"/>
+                <w:lang w:val="ru-RU"/>
+              </w:rPr>
+              <w:t xml:space="preserve"> </w:t>
+            </w:r>
+            <w:proofErr w:type="spellStart"/>
+            <w:r>
+              <w:rPr>
+                <w:rFonts w:ascii="Arial" w:hAnsi="Arial" w:cs="Arial"/>
+                <w:b/>
+                <w:bCs/>
+                <w:sz w:val="16"/>
+                <w:szCs w:val="16"/>
+                <w:bdr w:val="none" w:sz="0" w:space="0" w:color="auto" w:frame="1"/>
+                <w:shd w:val="clear" w:color="auto" w:fill="FFFFFF"/>
+                <w:lang w:val="ru-RU"/>
+              </w:rPr>
+              <w:t>Улбай</w:t>
+            </w:r>
+            <w:proofErr w:type="spellEnd"/>
             <w:r>
               <w:rPr>
                 <w:rStyle w:val="Hyperlink"/>
@@ -1678,39 +2034,7 @@
                 <w:shd w:val="clear" w:color="auto" w:fill="FFFFFF"/>
                 <w:lang w:val="ru-RU"/>
               </w:rPr>
-              <w:t xml:space="preserve"> </w:t>
-            </w:r>
-            <w:r>
-              <w:rPr>
-                <w:rStyle w:val="Hyperlink"/>
-                <w:rFonts w:ascii="Arial" w:hAnsi="Arial" w:cs="Arial"/>
-                <w:b/>
-                <w:bCs/>
-                <w:color w:val="auto"/>
-                <w:sz w:val="16"/>
-                <w:szCs w:val="16"/>
-                <w:u w:val="none"/>
-                <w:bdr w:val="none" w:sz="0" w:space="0" w:color="auto" w:frame="1"/>
-                <w:shd w:val="clear" w:color="auto" w:fill="FFFFFF"/>
-                <w:lang w:val="ru-RU"/>
-              </w:rPr>
-              <w:t>60 лет</w:t>
-            </w:r>
-            <w:r>
-              <w:rPr>
-                <w:rStyle w:val="Hyperlink"/>
-                <w:rFonts w:ascii="Arial" w:hAnsi="Arial" w:cs="Arial"/>
-                <w:b/>
-                <w:bCs/>
-                <w:color w:val="auto"/>
-                <w:sz w:val="16"/>
-                <w:szCs w:val="16"/>
-                <w:u w:val="none"/>
-                <w:bdr w:val="none" w:sz="0" w:space="0" w:color="auto" w:frame="1"/>
-                <w:shd w:val="clear" w:color="auto" w:fill="FFFFFF"/>
-                <w:lang w:val="ru-RU"/>
-              </w:rPr>
-              <w:t xml:space="preserve"> </w:t>
+              <w:t xml:space="preserve"> 60 лет </w:t>
             </w:r>
           </w:p>
           <w:p>
@@ -1730,7 +2054,67 @@
                 <w:szCs w:val="16"/>
                 <w:lang w:val="ru-RU"/>
               </w:rPr>
-              <w:t>1877 г.р., м.р.: Кош-Агачский р-н, с. Чаган-Узун, алтайка, Кам. прож.: Кош-Агачский р-н, арестована 05.11.1937. Приговор: ВМН. Расстреляна 15.12.1937</w:t>
+              <w:t xml:space="preserve">1877 г.р., </w:t>
+            </w:r>
+            <w:proofErr w:type="spellStart"/>
+            <w:r>
+              <w:rPr>
+                <w:rFonts w:ascii="Arial" w:hAnsi="Arial" w:cs="Arial"/>
+                <w:sz w:val="16"/>
+                <w:szCs w:val="16"/>
+                <w:lang w:val="ru-RU"/>
+              </w:rPr>
+              <w:t>м.р</w:t>
+            </w:r>
+            <w:proofErr w:type="spellEnd"/>
+            <w:r>
+              <w:rPr>
+                <w:rFonts w:ascii="Arial" w:hAnsi="Arial" w:cs="Arial"/>
+                <w:sz w:val="16"/>
+                <w:szCs w:val="16"/>
+                <w:lang w:val="ru-RU"/>
+              </w:rPr>
+              <w:t xml:space="preserve">.: Кош-Агачский р-н, с. Чаган-Узун, алтайка, </w:t>
+            </w:r>
+            <w:proofErr w:type="spellStart"/>
+            <w:r>
+              <w:rPr>
+                <w:rFonts w:ascii="Arial" w:hAnsi="Arial" w:cs="Arial"/>
+                <w:sz w:val="16"/>
+                <w:szCs w:val="16"/>
+                <w:lang w:val="ru-RU"/>
+              </w:rPr>
+              <w:t>Кам</w:t>
+            </w:r>
+            <w:proofErr w:type="spellEnd"/>
+            <w:r>
+              <w:rPr>
+                <w:rFonts w:ascii="Arial" w:hAnsi="Arial" w:cs="Arial"/>
+                <w:sz w:val="16"/>
+                <w:szCs w:val="16"/>
+                <w:lang w:val="ru-RU"/>
+              </w:rPr>
+              <w:t xml:space="preserve">. </w:t>
+            </w:r>
+            <w:proofErr w:type="spellStart"/>
+            <w:r>
+              <w:rPr>
+                <w:rFonts w:ascii="Arial" w:hAnsi="Arial" w:cs="Arial"/>
+                <w:sz w:val="16"/>
+                <w:szCs w:val="16"/>
+                <w:lang w:val="ru-RU"/>
+              </w:rPr>
+              <w:t>прож</w:t>
+            </w:r>
+            <w:proofErr w:type="spellEnd"/>
+            <w:r>
+              <w:rPr>
+                <w:rFonts w:ascii="Arial" w:hAnsi="Arial" w:cs="Arial"/>
+                <w:sz w:val="16"/>
+                <w:szCs w:val="16"/>
+                <w:lang w:val="ru-RU"/>
+              </w:rPr>
+              <w:t>.: Кош-Агачский р-н, арестована 05.11.1937. Приговор: ВМН. Расстреляна 15.12.1937</w:t>
             </w:r>
           </w:p>
           <w:p>
@@ -1756,42 +2140,9 @@
                 <w:szCs w:val="16"/>
                 <w:lang w:val="ru-RU"/>
               </w:rPr>
-              <w:t>Источник:</w:t>
-            </w:r>
-            <w:r>
-              <w:rPr>
-                <w:rFonts w:ascii="Arial" w:hAnsi="Arial" w:cs="Arial"/>
-                <w:b/>
-                <w:bCs/>
-                <w:sz w:val="16"/>
-                <w:szCs w:val="16"/>
-                <w:lang w:val="ru-RU"/>
-              </w:rPr>
-              <w:t xml:space="preserve"> БД "Жертвы политического террора в СССР"; Книга памяти Республики Алтай</w:t>
-            </w:r>
-            <w:r>
-              <w:rPr>
-                <w:rFonts w:ascii="Arial" w:hAnsi="Arial" w:cs="Arial"/>
-                <w:b/>
-                <w:bCs/>
-                <w:sz w:val="16"/>
-                <w:szCs w:val="16"/>
-                <w:lang w:val="ru-RU"/>
-              </w:rPr>
-              <w:t>;</w:t>
-            </w:r>
-            <w:r>
-              <w:rPr>
-                <w:rFonts w:ascii="Arial" w:hAnsi="Arial" w:cs="Arial"/>
-                <w:b/>
-                <w:bCs/>
-                <w:sz w:val="16"/>
-                <w:szCs w:val="16"/>
-                <w:lang w:val="ru-RU"/>
-              </w:rPr>
-              <w:t xml:space="preserve"> </w:t>
-            </w:r>
-            <w:hyperlink r:id="rId14" w:history="1">
+              <w:t xml:space="preserve">Источник: БД "Жертвы политического террора в СССР"; Книга памяти Республики Алтай; </w:t>
+            </w:r>
+            <w:hyperlink r:id="rId13" w:history="1">
               <w:r>
                 <w:rPr>
                   <w:rStyle w:val="Hyperlink"/>
@@ -1835,6 +2186,7 @@
                 <w:lang w:val="ru-RU"/>
               </w:rPr>
             </w:pPr>
+            <w:proofErr w:type="spellStart"/>
             <w:r>
               <w:rPr>
                 <w:rFonts w:ascii="Arial" w:hAnsi="Arial" w:cs="Arial"/>
@@ -1844,8 +2196,9 @@
                 <w:szCs w:val="16"/>
                 <w:lang w:val="ru-RU"/>
               </w:rPr>
-              <w:t>Интутова Анна Ивановна</w:t>
-            </w:r>
+              <w:t>Интутова</w:t>
+            </w:r>
+            <w:proofErr w:type="spellEnd"/>
             <w:r>
               <w:rPr>
                 <w:rFonts w:ascii="Arial" w:hAnsi="Arial" w:cs="Arial"/>
@@ -1855,29 +2208,7 @@
                 <w:szCs w:val="16"/>
                 <w:lang w:val="ru-RU"/>
               </w:rPr>
-              <w:t xml:space="preserve"> </w:t>
-            </w:r>
-            <w:r>
-              <w:rPr>
-                <w:rFonts w:ascii="Arial" w:hAnsi="Arial" w:cs="Arial"/>
-                <w:b/>
-                <w:bCs/>
-                <w:sz w:val="16"/>
-                <w:szCs w:val="16"/>
-                <w:lang w:val="ru-RU"/>
-              </w:rPr>
-              <w:t>36 лет</w:t>
-            </w:r>
-            <w:r>
-              <w:rPr>
-                <w:rFonts w:ascii="Arial" w:hAnsi="Arial" w:cs="Arial"/>
-                <w:b/>
-                <w:bCs/>
-                <w:sz w:val="16"/>
-                <w:szCs w:val="16"/>
-                <w:lang w:val="ru-RU"/>
-              </w:rPr>
-              <w:t xml:space="preserve"> </w:t>
+              <w:t xml:space="preserve"> Анна Ивановна 36 лет </w:t>
             </w:r>
           </w:p>
           <w:p>
@@ -1899,7 +2230,27 @@
                 <w:szCs w:val="16"/>
                 <w:lang w:val="ru-RU"/>
               </w:rPr>
-              <w:t>(варианты фамилии: Маганакова) Родилась</w:t>
+              <w:t xml:space="preserve">(варианты фамилии: </w:t>
+            </w:r>
+            <w:proofErr w:type="spellStart"/>
+            <w:r>
+              <w:rPr>
+                <w:rFonts w:ascii="Arial" w:hAnsi="Arial" w:cs="Arial"/>
+                <w:sz w:val="16"/>
+                <w:szCs w:val="16"/>
+                <w:lang w:val="ru-RU"/>
+              </w:rPr>
+              <w:t>Маганакова</w:t>
+            </w:r>
+            <w:proofErr w:type="spellEnd"/>
+            <w:r>
+              <w:rPr>
+                <w:rFonts w:ascii="Arial" w:hAnsi="Arial" w:cs="Arial"/>
+                <w:sz w:val="16"/>
+                <w:szCs w:val="16"/>
+                <w:lang w:val="ru-RU"/>
+              </w:rPr>
+              <w:t>) Родилась</w:t>
             </w:r>
             <w:r>
               <w:rPr>
@@ -1916,7 +2267,27 @@
                 <w:szCs w:val="16"/>
                 <w:lang w:val="ru-RU"/>
               </w:rPr>
-              <w:t>в 1902 г., с. Аскиз Аскызской вол. Минусинского уезда Енисейской губ.; хакаска; образование Коммунистический институт трудящихся Востока; Председатель Аскизского райисполкома. Арестована 14 октября 1937 г.</w:t>
+              <w:t xml:space="preserve">в 1902 г., с. Аскиз </w:t>
+            </w:r>
+            <w:proofErr w:type="spellStart"/>
+            <w:r>
+              <w:rPr>
+                <w:rFonts w:ascii="Arial" w:hAnsi="Arial" w:cs="Arial"/>
+                <w:sz w:val="16"/>
+                <w:szCs w:val="16"/>
+                <w:lang w:val="ru-RU"/>
+              </w:rPr>
+              <w:t>Аскызской</w:t>
+            </w:r>
+            <w:proofErr w:type="spellEnd"/>
+            <w:r>
+              <w:rPr>
+                <w:rFonts w:ascii="Arial" w:hAnsi="Arial" w:cs="Arial"/>
+                <w:sz w:val="16"/>
+                <w:szCs w:val="16"/>
+                <w:lang w:val="ru-RU"/>
+              </w:rPr>
+              <w:t xml:space="preserve"> вол. Минусинского уезда Енисейской губ.; хакаска; образование Коммунистический институт трудящихся Востока; Председатель Аскизского райисполкома. Арестована 14 октября 1937 г.</w:t>
             </w:r>
             <w:r>
               <w:rPr>
@@ -1926,7 +2297,27 @@
                 <w:lang w:val="ru-RU"/>
               </w:rPr>
               <w:br/>
-              <w:t>Приговорена: ВК ВС СССР 13 июля 1938 г., обв.:</w:t>
+              <w:t xml:space="preserve">Приговорена: ВК ВС СССР 13 июля 1938 г., </w:t>
+            </w:r>
+            <w:proofErr w:type="spellStart"/>
+            <w:r>
+              <w:rPr>
+                <w:rFonts w:ascii="Arial" w:hAnsi="Arial" w:cs="Arial"/>
+                <w:sz w:val="16"/>
+                <w:szCs w:val="16"/>
+                <w:lang w:val="ru-RU"/>
+              </w:rPr>
+              <w:t>обв</w:t>
+            </w:r>
+            <w:proofErr w:type="spellEnd"/>
+            <w:r>
+              <w:rPr>
+                <w:rFonts w:ascii="Arial" w:hAnsi="Arial" w:cs="Arial"/>
+                <w:sz w:val="16"/>
+                <w:szCs w:val="16"/>
+                <w:lang w:val="ru-RU"/>
+              </w:rPr>
+              <w:t>.:</w:t>
             </w:r>
             <w:r>
               <w:rPr>
@@ -1943,25 +2334,7 @@
                 <w:szCs w:val="16"/>
                 <w:lang w:val="ru-RU"/>
               </w:rPr>
-              <w:t>ст. 58—10 УК РСФСР. Приговор: ВМН Расстреляна 13 июля 1938 г. Место захоронения</w:t>
-            </w:r>
-            <w:r>
-              <w:rPr>
-                <w:rFonts w:ascii="Arial" w:hAnsi="Arial" w:cs="Arial"/>
-                <w:sz w:val="16"/>
-                <w:szCs w:val="16"/>
-                <w:lang w:val="ru-RU"/>
-              </w:rPr>
-              <w:t xml:space="preserve"> – </w:t>
-            </w:r>
-            <w:r>
-              <w:rPr>
-                <w:rFonts w:ascii="Arial" w:hAnsi="Arial" w:cs="Arial"/>
-                <w:sz w:val="16"/>
-                <w:szCs w:val="16"/>
-                <w:lang w:val="ru-RU"/>
-              </w:rPr>
-              <w:t>в г. Красноярске. Реабилитирована 21 мая 1957 г. ВК ВС СССР</w:t>
+              <w:t>ст. 58—10 УК РСФСР. Приговор: ВМН Расстреляна 13 июля 1938 г. Место захоронения – в г. Красноярске. Реабилитирована 21 мая 1957 г. ВК ВС СССР</w:t>
             </w:r>
           </w:p>
           <w:p>
@@ -1994,7 +2367,7 @@
               </w:rPr>
               <w:t xml:space="preserve"> </w:t>
             </w:r>
-            <w:hyperlink r:id="rId15" w:history="1">
+            <w:hyperlink r:id="rId14" w:history="1">
               <w:r>
                 <w:rPr>
                   <w:rStyle w:val="Hyperlink"/>
@@ -2040,6 +2413,7 @@
                 <w:lang w:val="ru-RU"/>
               </w:rPr>
             </w:pPr>
+            <w:proofErr w:type="spellStart"/>
             <w:r>
               <w:rPr>
                 <w:rFonts w:ascii="Arial" w:hAnsi="Arial" w:cs="Arial"/>
@@ -2049,116 +2423,19 @@
                 <w:szCs w:val="16"/>
                 <w:lang w:val="ru-RU"/>
               </w:rPr>
-              <w:t>Киргиненкова Мария Дмитриевна 46 лет</w:t>
-            </w:r>
-          </w:p>
-          <w:p>
-            <w:pPr>
-              <w:pStyle w:val="cont"/>
-              <w:spacing w:before="0" w:beforeAutospacing="0" w:after="0" w:afterAutospacing="0"/>
-              <w:rPr>
-                <w:rFonts w:ascii="Arial" w:hAnsi="Arial" w:cs="Arial"/>
-                <w:sz w:val="16"/>
-                <w:szCs w:val="16"/>
-                <w:lang w:val="ru-RU"/>
-              </w:rPr>
-            </w:pPr>
-            <w:r>
-              <w:rPr>
-                <w:rFonts w:ascii="Arial" w:hAnsi="Arial" w:cs="Arial"/>
-                <w:sz w:val="16"/>
-                <w:szCs w:val="16"/>
-                <w:lang w:val="ru-RU"/>
-              </w:rPr>
-              <w:t>(</w:t>
-            </w:r>
-            <w:r>
-              <w:rPr>
-                <w:rFonts w:ascii="Arial" w:hAnsi="Arial" w:cs="Arial"/>
-                <w:sz w:val="16"/>
-                <w:szCs w:val="16"/>
-                <w:shd w:val="clear" w:color="auto" w:fill="FFFFFF"/>
-                <w:lang w:val="ru-RU"/>
-              </w:rPr>
-              <w:t>Кок Мария Дмитриевна</w:t>
-            </w:r>
-            <w:r>
-              <w:rPr>
-                <w:rFonts w:ascii="Arial" w:hAnsi="Arial" w:cs="Arial"/>
-                <w:sz w:val="16"/>
-                <w:szCs w:val="16"/>
-                <w:lang w:val="ru-RU"/>
-              </w:rPr>
-              <w:t>) Родилась</w:t>
-            </w:r>
-            <w:r>
-              <w:rPr>
-                <w:rFonts w:ascii="Arial" w:hAnsi="Arial" w:cs="Arial"/>
-                <w:sz w:val="16"/>
-                <w:szCs w:val="16"/>
-              </w:rPr>
-              <w:t> </w:t>
-            </w:r>
-            <w:r>
-              <w:rPr>
-                <w:rFonts w:ascii="Arial" w:hAnsi="Arial" w:cs="Arial"/>
-                <w:sz w:val="16"/>
-                <w:szCs w:val="16"/>
-                <w:lang w:val="ru-RU"/>
-              </w:rPr>
-              <w:t>в 1885 г., улуса Конкос Аскызской вол. Минусинского округа Енисейской губ.; хакаска; неграмотная; Домохозяйка. Проживала:</w:t>
-            </w:r>
-            <w:r>
-              <w:rPr>
-                <w:rFonts w:ascii="Arial" w:hAnsi="Arial" w:cs="Arial"/>
-                <w:sz w:val="16"/>
-                <w:szCs w:val="16"/>
-              </w:rPr>
-              <w:t> </w:t>
-            </w:r>
-            <w:r>
-              <w:rPr>
-                <w:rFonts w:ascii="Arial" w:hAnsi="Arial" w:cs="Arial"/>
-                <w:sz w:val="16"/>
-                <w:szCs w:val="16"/>
-                <w:lang w:val="ru-RU"/>
-              </w:rPr>
-              <w:t>улуса Конкос Аскызской вол. Минусинского округа Енисейской губ. Арестована 15 мая 1931 г. Приговорена: особой тройкой ПП ОГПУ ЗСК 2 июля 1931 г., обв.:</w:t>
-            </w:r>
-            <w:r>
-              <w:rPr>
-                <w:rFonts w:ascii="Arial" w:hAnsi="Arial" w:cs="Arial"/>
-                <w:sz w:val="16"/>
-                <w:szCs w:val="16"/>
-              </w:rPr>
-              <w:t> </w:t>
-            </w:r>
-            <w:r>
-              <w:rPr>
-                <w:rFonts w:ascii="Arial" w:hAnsi="Arial" w:cs="Arial"/>
-                <w:sz w:val="16"/>
-                <w:szCs w:val="16"/>
-                <w:lang w:val="ru-RU"/>
-              </w:rPr>
-              <w:t>АСД. Приговор: ВМН Расстреляна 17 июля 1931 г. Место захоронения</w:t>
-            </w:r>
-            <w:r>
-              <w:rPr>
-                <w:rFonts w:ascii="Arial" w:hAnsi="Arial" w:cs="Arial"/>
-                <w:sz w:val="16"/>
-                <w:szCs w:val="16"/>
-                <w:lang w:val="ru-RU"/>
-              </w:rPr>
-              <w:t xml:space="preserve"> – </w:t>
-            </w:r>
-            <w:r>
-              <w:rPr>
-                <w:rFonts w:ascii="Arial" w:hAnsi="Arial" w:cs="Arial"/>
-                <w:sz w:val="16"/>
-                <w:szCs w:val="16"/>
-                <w:lang w:val="ru-RU"/>
-              </w:rPr>
-              <w:t>в г. Абакане. Реабилитирована 7 марта 1991 г. прокуратурой КК</w:t>
+              <w:t>Кидиекова</w:t>
+            </w:r>
+            <w:proofErr w:type="spellEnd"/>
+            <w:r>
+              <w:rPr>
+                <w:rFonts w:ascii="Arial" w:hAnsi="Arial" w:cs="Arial"/>
+                <w:b/>
+                <w:bCs/>
+                <w:sz w:val="16"/>
+                <w:szCs w:val="16"/>
+                <w:lang w:val="ru-RU"/>
+              </w:rPr>
+              <w:t xml:space="preserve"> Мария 15 лет</w:t>
             </w:r>
           </w:p>
           <w:p>
@@ -2168,6 +2445,48 @@
               <w:ind w:right="75"/>
               <w:rPr>
                 <w:rFonts w:ascii="Arial" w:hAnsi="Arial" w:cs="Arial"/>
+                <w:sz w:val="16"/>
+                <w:szCs w:val="16"/>
+                <w:lang w:val="ru-RU"/>
+              </w:rPr>
+            </w:pPr>
+            <w:r>
+              <w:rPr>
+                <w:rFonts w:ascii="Arial" w:hAnsi="Arial" w:cs="Arial"/>
+                <w:sz w:val="16"/>
+                <w:szCs w:val="16"/>
+                <w:lang w:val="ru-RU"/>
+              </w:rPr>
+              <w:t xml:space="preserve">1907 г.р., хакаска, в августе 1922 расстреляна в Хакасии как заложница. Вместе с ней расстреляны </w:t>
+            </w:r>
+            <w:proofErr w:type="spellStart"/>
+            <w:r>
+              <w:rPr>
+                <w:rFonts w:ascii="Arial" w:hAnsi="Arial" w:cs="Arial"/>
+                <w:sz w:val="16"/>
+                <w:szCs w:val="16"/>
+                <w:lang w:val="ru-RU"/>
+              </w:rPr>
+              <w:t>Тайдокова</w:t>
+            </w:r>
+            <w:proofErr w:type="spellEnd"/>
+            <w:r>
+              <w:rPr>
+                <w:rFonts w:ascii="Arial" w:hAnsi="Arial" w:cs="Arial"/>
+                <w:sz w:val="16"/>
+                <w:szCs w:val="16"/>
+                <w:lang w:val="ru-RU"/>
+              </w:rPr>
+              <w:t xml:space="preserve"> Анна 18 и Кокова Т. 11 лет ВЫПИСКА ИЗ ПРИКАЗА №-014/К от 21 августа 1922 года</w:t>
+            </w:r>
+          </w:p>
+          <w:p>
+            <w:pPr>
+              <w:pStyle w:val="name"/>
+              <w:spacing w:before="0" w:beforeAutospacing="0" w:after="0" w:afterAutospacing="0"/>
+              <w:ind w:right="75"/>
+              <w:rPr>
+                <w:rFonts w:ascii="Arial" w:hAnsi="Arial" w:cs="Arial"/>
                 <w:b/>
                 <w:bCs/>
                 <w:sz w:val="16"/>
@@ -2184,6 +2503,335 @@
                 <w:szCs w:val="16"/>
                 <w:lang w:val="ru-RU"/>
               </w:rPr>
+              <w:t>Источник: Книга памяти Республики Хакасия;</w:t>
+            </w:r>
+            <w:r>
+              <w:rPr>
+                <w:rFonts w:ascii="Arial" w:hAnsi="Arial" w:cs="Arial"/>
+                <w:b/>
+                <w:bCs/>
+                <w:sz w:val="16"/>
+                <w:szCs w:val="16"/>
+              </w:rPr>
+              <w:t> </w:t>
+            </w:r>
+            <w:hyperlink r:id="rId15" w:tgtFrame="_blank" w:history="1">
+              <w:r>
+                <w:rPr>
+                  <w:rStyle w:val="Hyperlink"/>
+                  <w:rFonts w:ascii="Arial" w:hAnsi="Arial" w:cs="Arial"/>
+                  <w:b/>
+                  <w:bCs/>
+                  <w:sz w:val="16"/>
+                  <w:szCs w:val="16"/>
+                  <w:lang w:val="ru-RU"/>
+                </w:rPr>
+                <w:t>Архивная ссылка</w:t>
+              </w:r>
+            </w:hyperlink>
+            <w:r>
+              <w:rPr>
+                <w:rFonts w:ascii="Arial" w:hAnsi="Arial" w:cs="Arial"/>
+                <w:b/>
+                <w:bCs/>
+                <w:sz w:val="16"/>
+                <w:szCs w:val="16"/>
+                <w:lang w:val="ru-RU"/>
+              </w:rPr>
+              <w:t>;</w:t>
+            </w:r>
+            <w:r>
+              <w:rPr>
+                <w:rFonts w:ascii="Arial" w:hAnsi="Arial" w:cs="Arial"/>
+                <w:b/>
+                <w:bCs/>
+                <w:sz w:val="16"/>
+                <w:szCs w:val="16"/>
+              </w:rPr>
+              <w:t> </w:t>
+            </w:r>
+            <w:hyperlink r:id="rId16" w:tgtFrame="_blank" w:history="1">
+              <w:r>
+                <w:rPr>
+                  <w:rStyle w:val="Hyperlink"/>
+                  <w:rFonts w:ascii="Arial" w:hAnsi="Arial" w:cs="Arial"/>
+                  <w:b/>
+                  <w:bCs/>
+                  <w:sz w:val="16"/>
+                  <w:szCs w:val="16"/>
+                  <w:lang w:val="ru-RU"/>
+                </w:rPr>
+                <w:t>Открытый список</w:t>
+              </w:r>
+            </w:hyperlink>
+          </w:p>
+        </w:tc>
+      </w:tr>
+      <w:tr>
+        <w:tc>
+          <w:tcPr>
+            <w:tcW w:w="11160" w:type="dxa"/>
+            <w:tcBorders>
+              <w:top w:val="double" w:sz="1" w:space="0" w:color="808080"/>
+              <w:left w:val="double" w:sz="1" w:space="0" w:color="808080"/>
+              <w:bottom w:val="double" w:sz="1" w:space="0" w:color="808080"/>
+              <w:right w:val="double" w:sz="2" w:space="0" w:color="808080"/>
+            </w:tcBorders>
+            <w:vAlign w:val="center"/>
+          </w:tcPr>
+          <w:p>
+            <w:pPr>
+              <w:pStyle w:val="name"/>
+              <w:spacing w:before="0" w:beforeAutospacing="0" w:after="0" w:afterAutospacing="0"/>
+              <w:ind w:right="75"/>
+              <w:rPr>
+                <w:rFonts w:ascii="Arial" w:hAnsi="Arial" w:cs="Arial"/>
+                <w:b/>
+                <w:bCs/>
+                <w:sz w:val="16"/>
+                <w:szCs w:val="16"/>
+                <w:lang w:val="ru-RU"/>
+              </w:rPr>
+            </w:pPr>
+            <w:proofErr w:type="spellStart"/>
+            <w:r>
+              <w:rPr>
+                <w:rFonts w:ascii="Arial" w:hAnsi="Arial" w:cs="Arial"/>
+                <w:b/>
+                <w:bCs/>
+                <w:sz w:val="16"/>
+                <w:szCs w:val="16"/>
+                <w:lang w:val="ru-RU"/>
+              </w:rPr>
+              <w:t>Киргиненкова</w:t>
+            </w:r>
+            <w:proofErr w:type="spellEnd"/>
+            <w:r>
+              <w:rPr>
+                <w:rFonts w:ascii="Arial" w:hAnsi="Arial" w:cs="Arial"/>
+                <w:b/>
+                <w:bCs/>
+                <w:sz w:val="16"/>
+                <w:szCs w:val="16"/>
+                <w:lang w:val="ru-RU"/>
+              </w:rPr>
+              <w:t xml:space="preserve"> Мария Дмитриевна 46 лет</w:t>
+            </w:r>
+          </w:p>
+          <w:p>
+            <w:pPr>
+              <w:pStyle w:val="cont"/>
+              <w:spacing w:before="0" w:beforeAutospacing="0" w:after="0" w:afterAutospacing="0"/>
+              <w:rPr>
+                <w:rFonts w:ascii="Arial" w:hAnsi="Arial" w:cs="Arial"/>
+                <w:sz w:val="16"/>
+                <w:szCs w:val="16"/>
+                <w:lang w:val="ru-RU"/>
+              </w:rPr>
+            </w:pPr>
+            <w:r>
+              <w:rPr>
+                <w:rFonts w:ascii="Arial" w:hAnsi="Arial" w:cs="Arial"/>
+                <w:sz w:val="16"/>
+                <w:szCs w:val="16"/>
+                <w:lang w:val="ru-RU"/>
+              </w:rPr>
+              <w:t>(</w:t>
+            </w:r>
+            <w:r>
+              <w:rPr>
+                <w:rFonts w:ascii="Arial" w:hAnsi="Arial" w:cs="Arial"/>
+                <w:sz w:val="16"/>
+                <w:szCs w:val="16"/>
+                <w:shd w:val="clear" w:color="auto" w:fill="FFFFFF"/>
+                <w:lang w:val="ru-RU"/>
+              </w:rPr>
+              <w:t>Кок Мария Дмитриевна</w:t>
+            </w:r>
+            <w:r>
+              <w:rPr>
+                <w:rFonts w:ascii="Arial" w:hAnsi="Arial" w:cs="Arial"/>
+                <w:sz w:val="16"/>
+                <w:szCs w:val="16"/>
+                <w:lang w:val="ru-RU"/>
+              </w:rPr>
+              <w:t>) Родилась</w:t>
+            </w:r>
+            <w:r>
+              <w:rPr>
+                <w:rFonts w:ascii="Arial" w:hAnsi="Arial" w:cs="Arial"/>
+                <w:sz w:val="16"/>
+                <w:szCs w:val="16"/>
+              </w:rPr>
+              <w:t> </w:t>
+            </w:r>
+            <w:r>
+              <w:rPr>
+                <w:rFonts w:ascii="Arial" w:hAnsi="Arial" w:cs="Arial"/>
+                <w:sz w:val="16"/>
+                <w:szCs w:val="16"/>
+                <w:lang w:val="ru-RU"/>
+              </w:rPr>
+              <w:t xml:space="preserve">в 1885 г., улуса </w:t>
+            </w:r>
+            <w:proofErr w:type="spellStart"/>
+            <w:r>
+              <w:rPr>
+                <w:rFonts w:ascii="Arial" w:hAnsi="Arial" w:cs="Arial"/>
+                <w:sz w:val="16"/>
+                <w:szCs w:val="16"/>
+                <w:lang w:val="ru-RU"/>
+              </w:rPr>
+              <w:t>Конкос</w:t>
+            </w:r>
+            <w:proofErr w:type="spellEnd"/>
+            <w:r>
+              <w:rPr>
+                <w:rFonts w:ascii="Arial" w:hAnsi="Arial" w:cs="Arial"/>
+                <w:sz w:val="16"/>
+                <w:szCs w:val="16"/>
+                <w:lang w:val="ru-RU"/>
+              </w:rPr>
+              <w:t xml:space="preserve"> </w:t>
+            </w:r>
+            <w:proofErr w:type="spellStart"/>
+            <w:r>
+              <w:rPr>
+                <w:rFonts w:ascii="Arial" w:hAnsi="Arial" w:cs="Arial"/>
+                <w:sz w:val="16"/>
+                <w:szCs w:val="16"/>
+                <w:lang w:val="ru-RU"/>
+              </w:rPr>
+              <w:t>Аскызской</w:t>
+            </w:r>
+            <w:proofErr w:type="spellEnd"/>
+            <w:r>
+              <w:rPr>
+                <w:rFonts w:ascii="Arial" w:hAnsi="Arial" w:cs="Arial"/>
+                <w:sz w:val="16"/>
+                <w:szCs w:val="16"/>
+                <w:lang w:val="ru-RU"/>
+              </w:rPr>
+              <w:t xml:space="preserve"> вол. Минусинского округа Енисейской губ.; хакаска; неграмотная; Домохозяйка. Проживала:</w:t>
+            </w:r>
+            <w:r>
+              <w:rPr>
+                <w:rFonts w:ascii="Arial" w:hAnsi="Arial" w:cs="Arial"/>
+                <w:sz w:val="16"/>
+                <w:szCs w:val="16"/>
+              </w:rPr>
+              <w:t> </w:t>
+            </w:r>
+            <w:r>
+              <w:rPr>
+                <w:rFonts w:ascii="Arial" w:hAnsi="Arial" w:cs="Arial"/>
+                <w:sz w:val="16"/>
+                <w:szCs w:val="16"/>
+                <w:lang w:val="ru-RU"/>
+              </w:rPr>
+              <w:t xml:space="preserve">улуса </w:t>
+            </w:r>
+            <w:proofErr w:type="spellStart"/>
+            <w:r>
+              <w:rPr>
+                <w:rFonts w:ascii="Arial" w:hAnsi="Arial" w:cs="Arial"/>
+                <w:sz w:val="16"/>
+                <w:szCs w:val="16"/>
+                <w:lang w:val="ru-RU"/>
+              </w:rPr>
+              <w:t>Конкос</w:t>
+            </w:r>
+            <w:proofErr w:type="spellEnd"/>
+            <w:r>
+              <w:rPr>
+                <w:rFonts w:ascii="Arial" w:hAnsi="Arial" w:cs="Arial"/>
+                <w:sz w:val="16"/>
+                <w:szCs w:val="16"/>
+                <w:lang w:val="ru-RU"/>
+              </w:rPr>
+              <w:t xml:space="preserve"> </w:t>
+            </w:r>
+            <w:proofErr w:type="spellStart"/>
+            <w:r>
+              <w:rPr>
+                <w:rFonts w:ascii="Arial" w:hAnsi="Arial" w:cs="Arial"/>
+                <w:sz w:val="16"/>
+                <w:szCs w:val="16"/>
+                <w:lang w:val="ru-RU"/>
+              </w:rPr>
+              <w:t>Аскызской</w:t>
+            </w:r>
+            <w:proofErr w:type="spellEnd"/>
+            <w:r>
+              <w:rPr>
+                <w:rFonts w:ascii="Arial" w:hAnsi="Arial" w:cs="Arial"/>
+                <w:sz w:val="16"/>
+                <w:szCs w:val="16"/>
+                <w:lang w:val="ru-RU"/>
+              </w:rPr>
+              <w:t xml:space="preserve"> вол. Минусинского округа Енисейской губ. Арестована 15 мая 1931 г. Приговорена: особой тройкой ПП ОГПУ ЗСК 2 июля 1931 г., </w:t>
+            </w:r>
+            <w:proofErr w:type="spellStart"/>
+            <w:r>
+              <w:rPr>
+                <w:rFonts w:ascii="Arial" w:hAnsi="Arial" w:cs="Arial"/>
+                <w:sz w:val="16"/>
+                <w:szCs w:val="16"/>
+                <w:lang w:val="ru-RU"/>
+              </w:rPr>
+              <w:t>обв</w:t>
+            </w:r>
+            <w:proofErr w:type="spellEnd"/>
+            <w:r>
+              <w:rPr>
+                <w:rFonts w:ascii="Arial" w:hAnsi="Arial" w:cs="Arial"/>
+                <w:sz w:val="16"/>
+                <w:szCs w:val="16"/>
+                <w:lang w:val="ru-RU"/>
+              </w:rPr>
+              <w:t>.:</w:t>
+            </w:r>
+            <w:r>
+              <w:rPr>
+                <w:rFonts w:ascii="Arial" w:hAnsi="Arial" w:cs="Arial"/>
+                <w:sz w:val="16"/>
+                <w:szCs w:val="16"/>
+              </w:rPr>
+              <w:t> </w:t>
+            </w:r>
+            <w:r>
+              <w:rPr>
+                <w:rFonts w:ascii="Arial" w:hAnsi="Arial" w:cs="Arial"/>
+                <w:sz w:val="16"/>
+                <w:szCs w:val="16"/>
+                <w:lang w:val="ru-RU"/>
+              </w:rPr>
+              <w:t>АСД. Приговор: ВМН Расстреляна 17 июля 1931 г. Место захоронения – в г. Абакане. Реабилитирована 7 марта 1991 г. прокуратурой КК</w:t>
+            </w:r>
+          </w:p>
+          <w:p>
+            <w:pPr>
+              <w:pStyle w:val="name"/>
+              <w:spacing w:before="0" w:beforeAutospacing="0" w:after="0" w:afterAutospacing="0"/>
+              <w:ind w:right="75"/>
+              <w:rPr>
+                <w:rFonts w:ascii="Arial" w:hAnsi="Arial" w:cs="Arial"/>
+                <w:b/>
+                <w:bCs/>
+                <w:sz w:val="16"/>
+                <w:szCs w:val="16"/>
+                <w:lang w:val="ru-RU"/>
+              </w:rPr>
+            </w:pPr>
+            <w:r>
+              <w:rPr>
+                <w:rFonts w:ascii="Arial" w:hAnsi="Arial" w:cs="Arial"/>
+                <w:b/>
+                <w:bCs/>
+                <w:sz w:val="16"/>
+                <w:szCs w:val="16"/>
+                <w:lang w:val="ru-RU"/>
+              </w:rPr>
               <w:t>Источник: Книга памяти Красноярского края;</w:t>
             </w:r>
             <w:r>
@@ -2195,7 +2843,7 @@
               </w:rPr>
               <w:t xml:space="preserve"> </w:t>
             </w:r>
-            <w:hyperlink r:id="rId16" w:history="1">
+            <w:hyperlink r:id="rId17" w:history="1">
               <w:r>
                 <w:rPr>
                   <w:rStyle w:val="Hyperlink"/>
@@ -2241,6 +2889,7 @@
                 <w:lang w:val="ru-RU"/>
               </w:rPr>
             </w:pPr>
+            <w:proofErr w:type="spellStart"/>
             <w:r>
               <w:rPr>
                 <w:rFonts w:ascii="Arial" w:hAnsi="Arial" w:cs="Arial"/>
@@ -2250,8 +2899,9 @@
                 <w:szCs w:val="16"/>
                 <w:lang w:val="ru-RU"/>
               </w:rPr>
-              <w:t>Мадяева Чыдырый</w:t>
-            </w:r>
+              <w:t>Мадяева</w:t>
+            </w:r>
+            <w:proofErr w:type="spellEnd"/>
             <w:r>
               <w:rPr>
                 <w:rFonts w:ascii="Arial" w:hAnsi="Arial" w:cs="Arial"/>
@@ -2263,6 +2913,7 @@
               </w:rPr>
               <w:t xml:space="preserve"> </w:t>
             </w:r>
+            <w:proofErr w:type="spellStart"/>
             <w:r>
               <w:rPr>
                 <w:rFonts w:ascii="Arial" w:hAnsi="Arial" w:cs="Arial"/>
@@ -2272,8 +2923,9 @@
                 <w:szCs w:val="16"/>
                 <w:lang w:val="ru-RU"/>
               </w:rPr>
-              <w:t>40 лет</w:t>
-            </w:r>
+              <w:t>Чыдырый</w:t>
+            </w:r>
+            <w:proofErr w:type="spellEnd"/>
             <w:r>
               <w:rPr>
                 <w:rFonts w:ascii="Arial" w:hAnsi="Arial" w:cs="Arial"/>
@@ -2283,7 +2935,7 @@
                 <w:szCs w:val="16"/>
                 <w:lang w:val="ru-RU"/>
               </w:rPr>
-              <w:t xml:space="preserve"> </w:t>
+              <w:t xml:space="preserve"> 40 лет </w:t>
             </w:r>
           </w:p>
           <w:p>
@@ -2322,7 +2974,47 @@
                 <w:szCs w:val="16"/>
                 <w:lang w:val="ru-RU"/>
               </w:rPr>
-              <w:t>в 1897 г., с. Курай.; теленгитка; неграмотная; Пастух колхоза "Джанж-Джон".. Проживала:</w:t>
+              <w:t xml:space="preserve">в 1897 г., с. Курай.; </w:t>
+            </w:r>
+            <w:proofErr w:type="spellStart"/>
+            <w:r>
+              <w:rPr>
+                <w:rFonts w:ascii="Arial" w:hAnsi="Arial" w:cs="Arial"/>
+                <w:sz w:val="16"/>
+                <w:szCs w:val="16"/>
+                <w:lang w:val="ru-RU"/>
+              </w:rPr>
+              <w:t>теленгитка</w:t>
+            </w:r>
+            <w:proofErr w:type="spellEnd"/>
+            <w:r>
+              <w:rPr>
+                <w:rFonts w:ascii="Arial" w:hAnsi="Arial" w:cs="Arial"/>
+                <w:sz w:val="16"/>
+                <w:szCs w:val="16"/>
+                <w:lang w:val="ru-RU"/>
+              </w:rPr>
+              <w:t>; неграмотная; Пастух колхоза "</w:t>
+            </w:r>
+            <w:proofErr w:type="spellStart"/>
+            <w:r>
+              <w:rPr>
+                <w:rFonts w:ascii="Arial" w:hAnsi="Arial" w:cs="Arial"/>
+                <w:sz w:val="16"/>
+                <w:szCs w:val="16"/>
+                <w:lang w:val="ru-RU"/>
+              </w:rPr>
+              <w:t>Джанж</w:t>
+            </w:r>
+            <w:proofErr w:type="spellEnd"/>
+            <w:r>
+              <w:rPr>
+                <w:rFonts w:ascii="Arial" w:hAnsi="Arial" w:cs="Arial"/>
+                <w:sz w:val="16"/>
+                <w:szCs w:val="16"/>
+                <w:lang w:val="ru-RU"/>
+              </w:rPr>
+              <w:t>-Джон".. Проживала:</w:t>
             </w:r>
             <w:r>
               <w:rPr>
@@ -2339,7 +3031,27 @@
                 <w:szCs w:val="16"/>
                 <w:lang w:val="ru-RU"/>
               </w:rPr>
-              <w:t>Кош-Агачский р-н. Арестована 10 сентября 1937 г. Приговор: расстреляна Расстреляна 20 ноября 1937 г.</w:t>
+              <w:t xml:space="preserve">Кош-Агачский р-н. Арестована 10 сентября 1937 г. Приговор: расстреляна </w:t>
+            </w:r>
+            <w:proofErr w:type="spellStart"/>
+            <w:r>
+              <w:rPr>
+                <w:rFonts w:ascii="Arial" w:hAnsi="Arial" w:cs="Arial"/>
+                <w:sz w:val="16"/>
+                <w:szCs w:val="16"/>
+                <w:lang w:val="ru-RU"/>
+              </w:rPr>
+              <w:t>Расстреляна</w:t>
+            </w:r>
+            <w:proofErr w:type="spellEnd"/>
+            <w:r>
+              <w:rPr>
+                <w:rFonts w:ascii="Arial" w:hAnsi="Arial" w:cs="Arial"/>
+                <w:sz w:val="16"/>
+                <w:szCs w:val="16"/>
+                <w:lang w:val="ru-RU"/>
+              </w:rPr>
+              <w:t xml:space="preserve"> 20 ноября 1937 г.</w:t>
             </w:r>
           </w:p>
           <w:p>
@@ -2374,7 +3086,7 @@
               </w:rPr>
               <w:t xml:space="preserve"> </w:t>
             </w:r>
-            <w:hyperlink r:id="rId17" w:history="1">
+            <w:hyperlink r:id="rId18" w:history="1">
               <w:r>
                 <w:rPr>
                   <w:rStyle w:val="Hyperlink"/>
@@ -2416,23 +3128,34 @@
                 <w:lang w:val="ru-RU"/>
               </w:rPr>
             </w:pPr>
-            <w:hyperlink r:id="rId18" w:history="1">
-              <w:r>
-                <w:rPr>
-                  <w:rStyle w:val="Hyperlink"/>
-                  <w:rFonts w:ascii="Arial" w:hAnsi="Arial" w:cs="Arial"/>
-                  <w:b/>
-                  <w:bCs/>
-                  <w:color w:val="auto"/>
-                  <w:sz w:val="16"/>
-                  <w:szCs w:val="16"/>
-                  <w:bdr w:val="none" w:sz="0" w:space="0" w:color="auto" w:frame="1"/>
-                  <w:shd w:val="clear" w:color="auto" w:fill="FFFFFF"/>
-                  <w:lang w:val="ru-RU"/>
-                </w:rPr>
-                <w:t>Персандер Евдокия Ивановна</w:t>
-              </w:r>
-            </w:hyperlink>
+            <w:proofErr w:type="spellStart"/>
+            <w:r>
+              <w:rPr>
+                <w:rFonts w:ascii="Arial" w:hAnsi="Arial" w:cs="Arial"/>
+                <w:b/>
+                <w:bCs/>
+                <w:sz w:val="16"/>
+                <w:szCs w:val="16"/>
+                <w:bdr w:val="none" w:sz="0" w:space="0" w:color="auto" w:frame="1"/>
+                <w:shd w:val="clear" w:color="auto" w:fill="FFFFFF"/>
+                <w:lang w:val="ru-RU"/>
+              </w:rPr>
+              <w:t>Персандер</w:t>
+            </w:r>
+            <w:proofErr w:type="spellEnd"/>
+            <w:r>
+              <w:rPr>
+                <w:rFonts w:ascii="Arial" w:hAnsi="Arial" w:cs="Arial"/>
+                <w:b/>
+                <w:bCs/>
+                <w:sz w:val="16"/>
+                <w:szCs w:val="16"/>
+                <w:bdr w:val="none" w:sz="0" w:space="0" w:color="auto" w:frame="1"/>
+                <w:shd w:val="clear" w:color="auto" w:fill="FFFFFF"/>
+                <w:lang w:val="ru-RU"/>
+              </w:rPr>
+              <w:t xml:space="preserve"> Евдокия Ивановна</w:t>
+            </w:r>
             <w:r>
               <w:rPr>
                 <w:rStyle w:val="Hyperlink"/>
@@ -2447,39 +3170,7 @@
                 <w:shd w:val="clear" w:color="auto" w:fill="FFFFFF"/>
                 <w:lang w:val="ru-RU"/>
               </w:rPr>
-              <w:t xml:space="preserve"> </w:t>
-            </w:r>
-            <w:r>
-              <w:rPr>
-                <w:rStyle w:val="Hyperlink"/>
-                <w:rFonts w:ascii="Arial" w:hAnsi="Arial" w:cs="Arial"/>
-                <w:b/>
-                <w:bCs/>
-                <w:color w:val="auto"/>
-                <w:sz w:val="16"/>
-                <w:szCs w:val="16"/>
-                <w:u w:val="none"/>
-                <w:bdr w:val="none" w:sz="0" w:space="0" w:color="auto" w:frame="1"/>
-                <w:shd w:val="clear" w:color="auto" w:fill="FFFFFF"/>
-                <w:lang w:val="ru-RU"/>
-              </w:rPr>
-              <w:t>44 года</w:t>
-            </w:r>
-            <w:r>
-              <w:rPr>
-                <w:rStyle w:val="Hyperlink"/>
-                <w:rFonts w:ascii="Arial" w:hAnsi="Arial" w:cs="Arial"/>
-                <w:b/>
-                <w:bCs/>
-                <w:color w:val="auto"/>
-                <w:sz w:val="16"/>
-                <w:szCs w:val="16"/>
-                <w:u w:val="none"/>
-                <w:bdr w:val="none" w:sz="0" w:space="0" w:color="auto" w:frame="1"/>
-                <w:shd w:val="clear" w:color="auto" w:fill="FFFFFF"/>
-                <w:lang w:val="ru-RU"/>
-              </w:rPr>
-              <w:t xml:space="preserve"> </w:t>
+              <w:t xml:space="preserve"> 44 года </w:t>
             </w:r>
           </w:p>
           <w:p>
@@ -2502,44 +3193,99 @@
                 <w:szCs w:val="16"/>
                 <w:lang w:val="ru-RU"/>
               </w:rPr>
-              <w:t>1894 г.р., м.р.: Бурят-Монгольская АССР, г. Кяхта, бурятка, б/п, домохозяйка, прож.: г. Иркутск, арестована 08.05.1938. Обвинение: ст. 58-1"а" УК РСФСР. Приговор: тройкой УНКВД Иркутской области, 20.10.1938</w:t>
-            </w:r>
-            <w:r>
-              <w:rPr>
-                <w:rFonts w:ascii="Arial" w:hAnsi="Arial" w:cs="Arial"/>
-                <w:sz w:val="16"/>
-                <w:szCs w:val="16"/>
-                <w:lang w:val="ru-RU"/>
-              </w:rPr>
-              <w:t xml:space="preserve"> – </w:t>
-            </w:r>
-            <w:r>
-              <w:rPr>
-                <w:rFonts w:ascii="Arial" w:hAnsi="Arial" w:cs="Arial"/>
-                <w:sz w:val="16"/>
-                <w:szCs w:val="16"/>
-                <w:lang w:val="ru-RU"/>
-              </w:rPr>
-              <w:t>ВМН. Расстреляна 23.10.1938, г. Иркутск. Реабилитация: Военным трибуналом ЗабВО, 13.11.1959. Арх.дело: 10493.</w:t>
-            </w:r>
-            <w:r>
-              <w:rPr>
-                <w:rFonts w:ascii="Arial" w:hAnsi="Arial" w:cs="Arial"/>
-                <w:sz w:val="16"/>
-                <w:szCs w:val="16"/>
-                <w:lang w:val="ru-RU"/>
-              </w:rPr>
-              <w:t xml:space="preserve"> </w:t>
-            </w:r>
-            <w:r>
-              <w:rPr>
-                <w:rFonts w:ascii="Arial" w:hAnsi="Arial" w:cs="Arial"/>
-                <w:sz w:val="16"/>
-                <w:szCs w:val="16"/>
-                <w:lang w:val="ru-RU"/>
-              </w:rPr>
-              <w:t>* Справку составила А. И. Швайкина</w:t>
-            </w:r>
+              <w:t xml:space="preserve">1894 г.р., </w:t>
+            </w:r>
+            <w:proofErr w:type="spellStart"/>
+            <w:r>
+              <w:rPr>
+                <w:rFonts w:ascii="Arial" w:hAnsi="Arial" w:cs="Arial"/>
+                <w:sz w:val="16"/>
+                <w:szCs w:val="16"/>
+                <w:lang w:val="ru-RU"/>
+              </w:rPr>
+              <w:t>м.р</w:t>
+            </w:r>
+            <w:proofErr w:type="spellEnd"/>
+            <w:r>
+              <w:rPr>
+                <w:rFonts w:ascii="Arial" w:hAnsi="Arial" w:cs="Arial"/>
+                <w:sz w:val="16"/>
+                <w:szCs w:val="16"/>
+                <w:lang w:val="ru-RU"/>
+              </w:rPr>
+              <w:t xml:space="preserve">.: Бурят-Монгольская АССР, г. Кяхта, бурятка, б/п, домохозяйка, </w:t>
+            </w:r>
+            <w:proofErr w:type="spellStart"/>
+            <w:r>
+              <w:rPr>
+                <w:rFonts w:ascii="Arial" w:hAnsi="Arial" w:cs="Arial"/>
+                <w:sz w:val="16"/>
+                <w:szCs w:val="16"/>
+                <w:lang w:val="ru-RU"/>
+              </w:rPr>
+              <w:t>прож</w:t>
+            </w:r>
+            <w:proofErr w:type="spellEnd"/>
+            <w:r>
+              <w:rPr>
+                <w:rFonts w:ascii="Arial" w:hAnsi="Arial" w:cs="Arial"/>
+                <w:sz w:val="16"/>
+                <w:szCs w:val="16"/>
+                <w:lang w:val="ru-RU"/>
+              </w:rPr>
+              <w:t xml:space="preserve">.: г. Иркутск, арестована 08.05.1938. Обвинение: ст. </w:t>
+            </w:r>
+            <w:proofErr w:type="gramStart"/>
+            <w:r>
+              <w:rPr>
+                <w:rFonts w:ascii="Arial" w:hAnsi="Arial" w:cs="Arial"/>
+                <w:sz w:val="16"/>
+                <w:szCs w:val="16"/>
+                <w:lang w:val="ru-RU"/>
+              </w:rPr>
+              <w:t>58-1</w:t>
+            </w:r>
+            <w:proofErr w:type="gramEnd"/>
+            <w:r>
+              <w:rPr>
+                <w:rFonts w:ascii="Arial" w:hAnsi="Arial" w:cs="Arial"/>
+                <w:sz w:val="16"/>
+                <w:szCs w:val="16"/>
+                <w:lang w:val="ru-RU"/>
+              </w:rPr>
+              <w:t xml:space="preserve">"а" УК РСФСР. Приговор: тройкой УНКВД Иркутской области, 20.10.1938 – ВМН. Расстреляна 23.10.1938, г. Иркутск. Реабилитация: Военным трибуналом ЗабВО, 13.11.1959. </w:t>
+            </w:r>
+            <w:proofErr w:type="spellStart"/>
+            <w:r>
+              <w:rPr>
+                <w:rFonts w:ascii="Arial" w:hAnsi="Arial" w:cs="Arial"/>
+                <w:sz w:val="16"/>
+                <w:szCs w:val="16"/>
+                <w:lang w:val="ru-RU"/>
+              </w:rPr>
+              <w:t>Арх.дело</w:t>
+            </w:r>
+            <w:proofErr w:type="spellEnd"/>
+            <w:r>
+              <w:rPr>
+                <w:rFonts w:ascii="Arial" w:hAnsi="Arial" w:cs="Arial"/>
+                <w:sz w:val="16"/>
+                <w:szCs w:val="16"/>
+                <w:lang w:val="ru-RU"/>
+              </w:rPr>
+              <w:t xml:space="preserve">: 10493. * Справку составила А. И. </w:t>
+            </w:r>
+            <w:proofErr w:type="spellStart"/>
+            <w:r>
+              <w:rPr>
+                <w:rFonts w:ascii="Arial" w:hAnsi="Arial" w:cs="Arial"/>
+                <w:sz w:val="16"/>
+                <w:szCs w:val="16"/>
+                <w:lang w:val="ru-RU"/>
+              </w:rPr>
+              <w:t>Швайкина</w:t>
+            </w:r>
+            <w:proofErr w:type="spellEnd"/>
           </w:p>
           <w:p>
             <w:pPr>
@@ -2560,51 +3306,7 @@
                 <w:szCs w:val="16"/>
                 <w:lang w:val="ru-RU"/>
               </w:rPr>
-              <w:t>Источник: Книга памяти Иркутской обл.</w:t>
-            </w:r>
-            <w:r>
-              <w:rPr>
-                <w:rFonts w:ascii="Arial" w:hAnsi="Arial" w:cs="Arial"/>
-                <w:b/>
-                <w:bCs/>
-                <w:sz w:val="16"/>
-                <w:szCs w:val="16"/>
-                <w:lang w:val="ru-RU"/>
-              </w:rPr>
-              <w:t>,</w:t>
-            </w:r>
-            <w:r>
-              <w:rPr>
-                <w:rFonts w:ascii="Arial" w:hAnsi="Arial" w:cs="Arial"/>
-                <w:b/>
-                <w:bCs/>
-                <w:sz w:val="16"/>
-                <w:szCs w:val="16"/>
-                <w:lang w:val="ru-RU"/>
-              </w:rPr>
-              <w:t xml:space="preserve"> т.7</w:t>
-            </w:r>
-            <w:r>
-              <w:rPr>
-                <w:rFonts w:ascii="Arial" w:hAnsi="Arial" w:cs="Arial"/>
-                <w:b/>
-                <w:bCs/>
-                <w:sz w:val="16"/>
-                <w:szCs w:val="16"/>
-                <w:lang w:val="ru-RU"/>
-              </w:rPr>
-              <w:t>;</w:t>
-            </w:r>
-            <w:r>
-              <w:rPr>
-                <w:rFonts w:ascii="Arial" w:hAnsi="Arial" w:cs="Arial"/>
-                <w:b/>
-                <w:bCs/>
-                <w:sz w:val="16"/>
-                <w:szCs w:val="16"/>
-                <w:lang w:val="ru-RU"/>
-              </w:rPr>
-              <w:t xml:space="preserve"> </w:t>
+              <w:t xml:space="preserve">Источник: Книга памяти Иркутской обл., т.7; </w:t>
             </w:r>
             <w:hyperlink r:id="rId19" w:history="1">
               <w:r>
@@ -2646,23 +3348,49 @@
                 <w:lang w:val="ru-RU"/>
               </w:rPr>
             </w:pPr>
-            <w:hyperlink r:id="rId20" w:history="1">
-              <w:r>
-                <w:rPr>
-                  <w:rStyle w:val="Hyperlink"/>
-                  <w:rFonts w:ascii="Arial" w:hAnsi="Arial" w:cs="Arial"/>
-                  <w:b/>
-                  <w:bCs/>
-                  <w:color w:val="auto"/>
-                  <w:sz w:val="16"/>
-                  <w:szCs w:val="16"/>
-                  <w:bdr w:val="none" w:sz="0" w:space="0" w:color="auto" w:frame="1"/>
-                  <w:shd w:val="clear" w:color="auto" w:fill="FFFFFF"/>
-                  <w:lang w:val="ru-RU"/>
-                </w:rPr>
-                <w:t>Содномова Ухин</w:t>
-              </w:r>
-            </w:hyperlink>
+            <w:proofErr w:type="spellStart"/>
+            <w:r>
+              <w:rPr>
+                <w:rFonts w:ascii="Arial" w:hAnsi="Arial" w:cs="Arial"/>
+                <w:b/>
+                <w:bCs/>
+                <w:sz w:val="16"/>
+                <w:szCs w:val="16"/>
+                <w:bdr w:val="none" w:sz="0" w:space="0" w:color="auto" w:frame="1"/>
+                <w:shd w:val="clear" w:color="auto" w:fill="FFFFFF"/>
+                <w:lang w:val="ru-RU"/>
+              </w:rPr>
+              <w:t>Содномова</w:t>
+            </w:r>
+            <w:proofErr w:type="spellEnd"/>
+            <w:r>
+              <w:rPr>
+                <w:rFonts w:ascii="Arial" w:hAnsi="Arial" w:cs="Arial"/>
+                <w:b/>
+                <w:bCs/>
+                <w:sz w:val="16"/>
+                <w:szCs w:val="16"/>
+                <w:bdr w:val="none" w:sz="0" w:space="0" w:color="auto" w:frame="1"/>
+                <w:shd w:val="clear" w:color="auto" w:fill="FFFFFF"/>
+                <w:lang w:val="ru-RU"/>
+              </w:rPr>
+              <w:t xml:space="preserve"> </w:t>
+            </w:r>
+            <w:proofErr w:type="spellStart"/>
+            <w:r>
+              <w:rPr>
+                <w:rFonts w:ascii="Arial" w:hAnsi="Arial" w:cs="Arial"/>
+                <w:b/>
+                <w:bCs/>
+                <w:sz w:val="16"/>
+                <w:szCs w:val="16"/>
+                <w:bdr w:val="none" w:sz="0" w:space="0" w:color="auto" w:frame="1"/>
+                <w:shd w:val="clear" w:color="auto" w:fill="FFFFFF"/>
+                <w:lang w:val="ru-RU"/>
+              </w:rPr>
+              <w:t>Ухин</w:t>
+            </w:r>
+            <w:proofErr w:type="spellEnd"/>
             <w:r>
               <w:rPr>
                 <w:rStyle w:val="Hyperlink"/>
@@ -2677,39 +3405,7 @@
                 <w:shd w:val="clear" w:color="auto" w:fill="FFFFFF"/>
                 <w:lang w:val="ru-RU"/>
               </w:rPr>
-              <w:t xml:space="preserve"> </w:t>
-            </w:r>
-            <w:r>
-              <w:rPr>
-                <w:rStyle w:val="Hyperlink"/>
-                <w:rFonts w:ascii="Arial" w:hAnsi="Arial" w:cs="Arial"/>
-                <w:b/>
-                <w:bCs/>
-                <w:color w:val="auto"/>
-                <w:sz w:val="16"/>
-                <w:szCs w:val="16"/>
-                <w:u w:val="none"/>
-                <w:bdr w:val="none" w:sz="0" w:space="0" w:color="auto" w:frame="1"/>
-                <w:shd w:val="clear" w:color="auto" w:fill="FFFFFF"/>
-                <w:lang w:val="ru-RU"/>
-              </w:rPr>
-              <w:t>56 лет</w:t>
-            </w:r>
-            <w:r>
-              <w:rPr>
-                <w:rStyle w:val="Hyperlink"/>
-                <w:rFonts w:ascii="Arial" w:hAnsi="Arial" w:cs="Arial"/>
-                <w:b/>
-                <w:bCs/>
-                <w:color w:val="auto"/>
-                <w:sz w:val="16"/>
-                <w:szCs w:val="16"/>
-                <w:u w:val="none"/>
-                <w:bdr w:val="none" w:sz="0" w:space="0" w:color="auto" w:frame="1"/>
-                <w:shd w:val="clear" w:color="auto" w:fill="FFFFFF"/>
-                <w:lang w:val="ru-RU"/>
-              </w:rPr>
-              <w:t xml:space="preserve"> </w:t>
+              <w:t xml:space="preserve"> 56 лет </w:t>
             </w:r>
           </w:p>
           <w:p>
@@ -2732,43 +3428,147 @@
                 <w:szCs w:val="16"/>
                 <w:lang w:val="ru-RU"/>
               </w:rPr>
-              <w:t>1882 г.р., м.р.: Забайкальская обл., Читинский уезд, бурятка, работала в колхозе им. Сталина, прож.: Читинская обл., Агинский Бурят-Монгольский национальный округ, с. Цокто-Хангил, арестована 01.01.1938, обвинение: по ст. 58-10 УК РСФСР. Приговор: Тройкой УНКВД по Читинской обл., 13.01.1938</w:t>
-            </w:r>
-            <w:r>
-              <w:rPr>
-                <w:rFonts w:ascii="Arial" w:hAnsi="Arial" w:cs="Arial"/>
-                <w:sz w:val="16"/>
-                <w:szCs w:val="16"/>
-                <w:lang w:val="ru-RU"/>
-              </w:rPr>
-              <w:t xml:space="preserve"> – </w:t>
-            </w:r>
-            <w:r>
-              <w:rPr>
-                <w:rFonts w:ascii="Arial" w:hAnsi="Arial" w:cs="Arial"/>
-                <w:sz w:val="16"/>
-                <w:szCs w:val="16"/>
-                <w:lang w:val="ru-RU"/>
-              </w:rPr>
-              <w:t>ВМН. Расстреляна 22.02.1938. Реабилитация: прокуратурой Читинской обл., 02.08.1989. Состав семьи: Муж Аюшиев Жамсаран, дети: Дондок, Сатай</w:t>
-            </w:r>
-            <w:r>
-              <w:rPr>
-                <w:rFonts w:ascii="Arial" w:hAnsi="Arial" w:cs="Arial"/>
-                <w:sz w:val="16"/>
-                <w:szCs w:val="16"/>
-                <w:lang w:val="ru-RU"/>
-              </w:rPr>
-              <w:t xml:space="preserve"> – </w:t>
-            </w:r>
-            <w:r>
-              <w:rPr>
-                <w:rFonts w:ascii="Arial" w:hAnsi="Arial" w:cs="Arial"/>
-                <w:sz w:val="16"/>
-                <w:szCs w:val="16"/>
-                <w:lang w:val="ru-RU"/>
-              </w:rPr>
-              <w:t>16.</w:t>
+              <w:t xml:space="preserve">1882 г.р., </w:t>
+            </w:r>
+            <w:proofErr w:type="spellStart"/>
+            <w:r>
+              <w:rPr>
+                <w:rFonts w:ascii="Arial" w:hAnsi="Arial" w:cs="Arial"/>
+                <w:sz w:val="16"/>
+                <w:szCs w:val="16"/>
+                <w:lang w:val="ru-RU"/>
+              </w:rPr>
+              <w:t>м.р</w:t>
+            </w:r>
+            <w:proofErr w:type="spellEnd"/>
+            <w:r>
+              <w:rPr>
+                <w:rFonts w:ascii="Arial" w:hAnsi="Arial" w:cs="Arial"/>
+                <w:sz w:val="16"/>
+                <w:szCs w:val="16"/>
+                <w:lang w:val="ru-RU"/>
+              </w:rPr>
+              <w:t xml:space="preserve">.: Забайкальская обл., Читинский уезд, бурятка, работала в колхозе им. Сталина, </w:t>
+            </w:r>
+            <w:proofErr w:type="spellStart"/>
+            <w:r>
+              <w:rPr>
+                <w:rFonts w:ascii="Arial" w:hAnsi="Arial" w:cs="Arial"/>
+                <w:sz w:val="16"/>
+                <w:szCs w:val="16"/>
+                <w:lang w:val="ru-RU"/>
+              </w:rPr>
+              <w:t>прож</w:t>
+            </w:r>
+            <w:proofErr w:type="spellEnd"/>
+            <w:r>
+              <w:rPr>
+                <w:rFonts w:ascii="Arial" w:hAnsi="Arial" w:cs="Arial"/>
+                <w:sz w:val="16"/>
+                <w:szCs w:val="16"/>
+                <w:lang w:val="ru-RU"/>
+              </w:rPr>
+              <w:t xml:space="preserve">.: Читинская обл., Агинский Бурят-Монгольский национальный округ, с. </w:t>
+            </w:r>
+            <w:proofErr w:type="spellStart"/>
+            <w:r>
+              <w:rPr>
+                <w:rFonts w:ascii="Arial" w:hAnsi="Arial" w:cs="Arial"/>
+                <w:sz w:val="16"/>
+                <w:szCs w:val="16"/>
+                <w:lang w:val="ru-RU"/>
+              </w:rPr>
+              <w:t>Цокто-Хангил</w:t>
+            </w:r>
+            <w:proofErr w:type="spellEnd"/>
+            <w:r>
+              <w:rPr>
+                <w:rFonts w:ascii="Arial" w:hAnsi="Arial" w:cs="Arial"/>
+                <w:sz w:val="16"/>
+                <w:szCs w:val="16"/>
+                <w:lang w:val="ru-RU"/>
+              </w:rPr>
+              <w:t xml:space="preserve">, арестована 01.01.1938, обвинение: по ст. 58-10 УК РСФСР. Приговор: Тройкой УНКВД по Читинской обл., 13.01.1938 – ВМН. Расстреляна 22.02.1938. Реабилитация: прокуратурой Читинской обл., 02.08.1989. Состав семьи: Муж </w:t>
+            </w:r>
+            <w:proofErr w:type="spellStart"/>
+            <w:r>
+              <w:rPr>
+                <w:rFonts w:ascii="Arial" w:hAnsi="Arial" w:cs="Arial"/>
+                <w:sz w:val="16"/>
+                <w:szCs w:val="16"/>
+                <w:lang w:val="ru-RU"/>
+              </w:rPr>
+              <w:t>Аюшиев</w:t>
+            </w:r>
+            <w:proofErr w:type="spellEnd"/>
+            <w:r>
+              <w:rPr>
+                <w:rFonts w:ascii="Arial" w:hAnsi="Arial" w:cs="Arial"/>
+                <w:sz w:val="16"/>
+                <w:szCs w:val="16"/>
+                <w:lang w:val="ru-RU"/>
+              </w:rPr>
+              <w:t xml:space="preserve"> </w:t>
+            </w:r>
+            <w:proofErr w:type="spellStart"/>
+            <w:r>
+              <w:rPr>
+                <w:rFonts w:ascii="Arial" w:hAnsi="Arial" w:cs="Arial"/>
+                <w:sz w:val="16"/>
+                <w:szCs w:val="16"/>
+                <w:lang w:val="ru-RU"/>
+              </w:rPr>
+              <w:t>Жамсаран</w:t>
+            </w:r>
+            <w:proofErr w:type="spellEnd"/>
+            <w:r>
+              <w:rPr>
+                <w:rFonts w:ascii="Arial" w:hAnsi="Arial" w:cs="Arial"/>
+                <w:sz w:val="16"/>
+                <w:szCs w:val="16"/>
+                <w:lang w:val="ru-RU"/>
+              </w:rPr>
+              <w:t xml:space="preserve">, дети: </w:t>
+            </w:r>
+            <w:proofErr w:type="spellStart"/>
+            <w:r>
+              <w:rPr>
+                <w:rFonts w:ascii="Arial" w:hAnsi="Arial" w:cs="Arial"/>
+                <w:sz w:val="16"/>
+                <w:szCs w:val="16"/>
+                <w:lang w:val="ru-RU"/>
+              </w:rPr>
+              <w:t>Дондок</w:t>
+            </w:r>
+            <w:proofErr w:type="spellEnd"/>
+            <w:r>
+              <w:rPr>
+                <w:rFonts w:ascii="Arial" w:hAnsi="Arial" w:cs="Arial"/>
+                <w:sz w:val="16"/>
+                <w:szCs w:val="16"/>
+                <w:lang w:val="ru-RU"/>
+              </w:rPr>
+              <w:t xml:space="preserve">, </w:t>
+            </w:r>
+            <w:proofErr w:type="spellStart"/>
+            <w:r>
+              <w:rPr>
+                <w:rFonts w:ascii="Arial" w:hAnsi="Arial" w:cs="Arial"/>
+                <w:sz w:val="16"/>
+                <w:szCs w:val="16"/>
+                <w:lang w:val="ru-RU"/>
+              </w:rPr>
+              <w:t>Сатай</w:t>
+            </w:r>
+            <w:proofErr w:type="spellEnd"/>
+            <w:r>
+              <w:rPr>
+                <w:rFonts w:ascii="Arial" w:hAnsi="Arial" w:cs="Arial"/>
+                <w:sz w:val="16"/>
+                <w:szCs w:val="16"/>
+                <w:lang w:val="ru-RU"/>
+              </w:rPr>
+              <w:t xml:space="preserve"> – 16.</w:t>
             </w:r>
           </w:p>
           <w:p>
@@ -2793,40 +3593,7 @@
                 <w:szCs w:val="16"/>
                 <w:lang w:val="ru-RU"/>
               </w:rPr>
-              <w:t>Источник: Книга памяти Читинской обл.</w:t>
-            </w:r>
-            <w:r>
-              <w:rPr>
-                <w:rFonts w:ascii="Arial" w:hAnsi="Arial" w:cs="Arial"/>
-                <w:b/>
-                <w:bCs/>
-                <w:sz w:val="16"/>
-                <w:szCs w:val="16"/>
-                <w:lang w:val="ru-RU"/>
-              </w:rPr>
-              <w:t>,</w:t>
-            </w:r>
-            <w:r>
-              <w:rPr>
-                <w:rFonts w:ascii="Arial" w:hAnsi="Arial" w:cs="Arial"/>
-                <w:b/>
-                <w:bCs/>
-                <w:sz w:val="16"/>
-                <w:szCs w:val="16"/>
-                <w:lang w:val="ru-RU"/>
-              </w:rPr>
-              <w:t xml:space="preserve"> т.8</w:t>
-            </w:r>
-            <w:r>
-              <w:rPr>
-                <w:rFonts w:ascii="Arial" w:hAnsi="Arial" w:cs="Arial"/>
-                <w:b/>
-                <w:bCs/>
-                <w:sz w:val="16"/>
-                <w:szCs w:val="16"/>
-                <w:lang w:val="ru-RU"/>
-              </w:rPr>
-              <w:t>;</w:t>
+              <w:t>Источник: Книга памяти Читинской обл., т.8;</w:t>
             </w:r>
             <w:r>
               <w:rPr>
@@ -2837,7 +3604,7 @@
               </w:rPr>
               <w:t xml:space="preserve"> </w:t>
             </w:r>
-            <w:hyperlink r:id="rId21" w:history="1">
+            <w:hyperlink r:id="rId20" w:history="1">
               <w:r>
                 <w:rPr>
                   <w:rStyle w:val="Hyperlink"/>
@@ -2878,6 +3645,7 @@
                 <w:lang w:val="ru-RU"/>
               </w:rPr>
             </w:pPr>
+            <w:proofErr w:type="spellStart"/>
             <w:r>
               <w:rPr>
                 <w:rFonts w:ascii="Arial" w:hAnsi="Arial" w:cs="Arial"/>
@@ -2887,7 +3655,19 @@
                 <w:szCs w:val="16"/>
                 <w:lang w:val="ru-RU"/>
               </w:rPr>
-              <w:t>Суйсина Зинаида Михайловна 18 лет</w:t>
+              <w:t>Суйсина</w:t>
+            </w:r>
+            <w:proofErr w:type="spellEnd"/>
+            <w:r>
+              <w:rPr>
+                <w:rFonts w:ascii="Arial" w:hAnsi="Arial" w:cs="Arial"/>
+                <w:b/>
+                <w:bCs/>
+                <w:sz w:val="16"/>
+                <w:szCs w:val="16"/>
+                <w:lang w:val="ru-RU"/>
+              </w:rPr>
+              <w:t xml:space="preserve"> Зинаида Михайловна 18 лет</w:t>
             </w:r>
           </w:p>
           <w:p>
@@ -2925,7 +3705,47 @@
                 <w:szCs w:val="16"/>
                 <w:lang w:val="ru-RU"/>
               </w:rPr>
-              <w:t>в 1919 г., Монголия; монголка; заключенная Ухтпечлага НКВД СССР. Арестована 8 июля 1937 г. Приговорена: тройка при УНКВД Северной обл. 29 сентября 1937 г., обв.:</w:t>
+              <w:t xml:space="preserve">в 1919 г., Монголия; монголка; заключенная </w:t>
+            </w:r>
+            <w:proofErr w:type="spellStart"/>
+            <w:r>
+              <w:rPr>
+                <w:rFonts w:ascii="Arial" w:hAnsi="Arial" w:cs="Arial"/>
+                <w:sz w:val="16"/>
+                <w:szCs w:val="16"/>
+                <w:lang w:val="ru-RU"/>
+              </w:rPr>
+              <w:t>Ухтпечлага</w:t>
+            </w:r>
+            <w:proofErr w:type="spellEnd"/>
+            <w:r>
+              <w:rPr>
+                <w:rFonts w:ascii="Arial" w:hAnsi="Arial" w:cs="Arial"/>
+                <w:sz w:val="16"/>
+                <w:szCs w:val="16"/>
+                <w:lang w:val="ru-RU"/>
+              </w:rPr>
+              <w:t xml:space="preserve"> НКВД СССР. Арестована 8 июля 1937 г. Приговорена: тройка при УНКВД Северной обл. 29 сентября 1937 г., </w:t>
+            </w:r>
+            <w:proofErr w:type="spellStart"/>
+            <w:r>
+              <w:rPr>
+                <w:rFonts w:ascii="Arial" w:hAnsi="Arial" w:cs="Arial"/>
+                <w:sz w:val="16"/>
+                <w:szCs w:val="16"/>
+                <w:lang w:val="ru-RU"/>
+              </w:rPr>
+              <w:t>обв</w:t>
+            </w:r>
+            <w:proofErr w:type="spellEnd"/>
+            <w:r>
+              <w:rPr>
+                <w:rFonts w:ascii="Arial" w:hAnsi="Arial" w:cs="Arial"/>
+                <w:sz w:val="16"/>
+                <w:szCs w:val="16"/>
+                <w:lang w:val="ru-RU"/>
+              </w:rPr>
+              <w:t>.:</w:t>
             </w:r>
             <w:r>
               <w:rPr>
@@ -2942,7 +3762,27 @@
                 <w:szCs w:val="16"/>
                 <w:lang w:val="ru-RU"/>
               </w:rPr>
-              <w:t>по ст. 58-10 УК РСФСР. Приговор: высшей мере наказания</w:t>
+              <w:t xml:space="preserve">по ст. </w:t>
+            </w:r>
+            <w:proofErr w:type="gramStart"/>
+            <w:r>
+              <w:rPr>
+                <w:rFonts w:ascii="Arial" w:hAnsi="Arial" w:cs="Arial"/>
+                <w:sz w:val="16"/>
+                <w:szCs w:val="16"/>
+                <w:lang w:val="ru-RU"/>
+              </w:rPr>
+              <w:t>58-10</w:t>
+            </w:r>
+            <w:proofErr w:type="gramEnd"/>
+            <w:r>
+              <w:rPr>
+                <w:rFonts w:ascii="Arial" w:hAnsi="Arial" w:cs="Arial"/>
+                <w:sz w:val="16"/>
+                <w:szCs w:val="16"/>
+                <w:lang w:val="ru-RU"/>
+              </w:rPr>
+              <w:t xml:space="preserve"> УК РСФСР. Приговор: высшей мере наказания</w:t>
             </w:r>
           </w:p>
           <w:p>
@@ -2977,7 +3817,7 @@
               </w:rPr>
               <w:t xml:space="preserve"> </w:t>
             </w:r>
-            <w:hyperlink r:id="rId22" w:history="1">
+            <w:hyperlink r:id="rId21" w:history="1">
               <w:r>
                 <w:rPr>
                   <w:rStyle w:val="Hyperlink"/>
@@ -3020,6 +3860,7 @@
                 <w:lang w:val="ru-RU"/>
               </w:rPr>
             </w:pPr>
+            <w:proofErr w:type="spellStart"/>
             <w:r>
               <w:rPr>
                 <w:rFonts w:ascii="Arial" w:hAnsi="Arial" w:cs="Arial"/>
@@ -3029,8 +3870,9 @@
                 <w:szCs w:val="16"/>
                 <w:lang w:val="ru-RU"/>
               </w:rPr>
-              <w:t>Темен</w:t>
-            </w:r>
+              <w:t>Теменекова-Маркитанова-Кобенова</w:t>
+            </w:r>
+            <w:proofErr w:type="spellEnd"/>
             <w:r>
               <w:rPr>
                 <w:rFonts w:ascii="Arial" w:hAnsi="Arial" w:cs="Arial"/>
@@ -3040,29 +3882,7 @@
                 <w:szCs w:val="16"/>
                 <w:lang w:val="ru-RU"/>
               </w:rPr>
-              <w:t>е</w:t>
-            </w:r>
-            <w:r>
-              <w:rPr>
-                <w:rFonts w:ascii="Arial" w:hAnsi="Arial" w:cs="Arial"/>
-                <w:b/>
-                <w:bCs/>
-                <w:sz w:val="16"/>
-                <w:szCs w:val="16"/>
-                <w:lang w:val="ru-RU"/>
-              </w:rPr>
-              <w:t>кова</w:t>
-            </w:r>
-            <w:r>
-              <w:rPr>
-                <w:rFonts w:ascii="Arial" w:hAnsi="Arial" w:cs="Arial"/>
-                <w:b/>
-                <w:bCs/>
-                <w:sz w:val="16"/>
-                <w:szCs w:val="16"/>
-                <w:lang w:val="ru-RU"/>
-              </w:rPr>
-              <w:t>-Маркитанова-Кобенова Ольга Никифоровна 35 лет</w:t>
+              <w:t xml:space="preserve"> Ольга Никифоровна 35 лет</w:t>
             </w:r>
           </w:p>
           <w:p>
@@ -3100,7 +3920,27 @@
                 <w:szCs w:val="16"/>
                 <w:lang w:val="ru-RU"/>
               </w:rPr>
-              <w:t>в 1902 г., с. Балыкча; алтайка; грамотная; член колхоза им. Тельмана.. Проживала:</w:t>
+              <w:t xml:space="preserve">в 1902 г., с. </w:t>
+            </w:r>
+            <w:proofErr w:type="spellStart"/>
+            <w:r>
+              <w:rPr>
+                <w:rFonts w:ascii="Arial" w:hAnsi="Arial" w:cs="Arial"/>
+                <w:sz w:val="16"/>
+                <w:szCs w:val="16"/>
+                <w:lang w:val="ru-RU"/>
+              </w:rPr>
+              <w:t>Балыкча</w:t>
+            </w:r>
+            <w:proofErr w:type="spellEnd"/>
+            <w:r>
+              <w:rPr>
+                <w:rFonts w:ascii="Arial" w:hAnsi="Arial" w:cs="Arial"/>
+                <w:sz w:val="16"/>
+                <w:szCs w:val="16"/>
+                <w:lang w:val="ru-RU"/>
+              </w:rPr>
+              <w:t>; алтайка; грамотная; член колхоза им. Тельмана.. Проживала:</w:t>
             </w:r>
             <w:r>
               <w:rPr>
@@ -3127,7 +3967,27 @@
                 <w:lang w:val="ru-RU"/>
               </w:rPr>
               <w:br/>
-              <w:t>Арестована 27 августа 1937 г. Приговор: расстреляна Расстреляна 12 ноября 1937 г.</w:t>
+              <w:t xml:space="preserve">Арестована 27 августа 1937 г. Приговор: расстреляна </w:t>
+            </w:r>
+            <w:proofErr w:type="spellStart"/>
+            <w:r>
+              <w:rPr>
+                <w:rFonts w:ascii="Arial" w:hAnsi="Arial" w:cs="Arial"/>
+                <w:sz w:val="16"/>
+                <w:szCs w:val="16"/>
+                <w:lang w:val="ru-RU"/>
+              </w:rPr>
+              <w:t>Расстреляна</w:t>
+            </w:r>
+            <w:proofErr w:type="spellEnd"/>
+            <w:r>
+              <w:rPr>
+                <w:rFonts w:ascii="Arial" w:hAnsi="Arial" w:cs="Arial"/>
+                <w:sz w:val="16"/>
+                <w:szCs w:val="16"/>
+                <w:lang w:val="ru-RU"/>
+              </w:rPr>
+              <w:t xml:space="preserve"> 12 ноября 1937 г.</w:t>
             </w:r>
           </w:p>
           <w:p>
@@ -3152,6 +4012,340 @@
                 <w:lang w:val="ru-RU"/>
               </w:rPr>
               <w:t xml:space="preserve">Источник: Книга памяти Республики Алтай; </w:t>
+            </w:r>
+            <w:hyperlink r:id="rId22" w:history="1">
+              <w:r>
+                <w:rPr>
+                  <w:rStyle w:val="Hyperlink"/>
+                  <w:rFonts w:ascii="Arial" w:hAnsi="Arial" w:cs="Arial"/>
+                  <w:b/>
+                  <w:bCs/>
+                  <w:color w:val="auto"/>
+                  <w:sz w:val="16"/>
+                  <w:szCs w:val="16"/>
+                  <w:lang w:val="ru-RU"/>
+                </w:rPr>
+                <w:t>Архивная ссылка</w:t>
+              </w:r>
+            </w:hyperlink>
+          </w:p>
+        </w:tc>
+      </w:tr>
+      <w:tr>
+        <w:tc>
+          <w:tcPr>
+            <w:tcW w:w="11160" w:type="dxa"/>
+            <w:tcBorders>
+              <w:left w:val="double" w:sz="1" w:space="0" w:color="808080"/>
+              <w:bottom w:val="double" w:sz="1" w:space="0" w:color="808080"/>
+              <w:right w:val="double" w:sz="2" w:space="0" w:color="808080"/>
+            </w:tcBorders>
+            <w:vAlign w:val="center"/>
+          </w:tcPr>
+          <w:p>
+            <w:pPr>
+              <w:spacing w:after="0"/>
+              <w:rPr>
+                <w:rFonts w:ascii="Arial" w:hAnsi="Arial" w:cs="Arial"/>
+                <w:b/>
+                <w:bCs/>
+                <w:sz w:val="18"/>
+                <w:szCs w:val="18"/>
+                <w:lang w:val="ru-RU"/>
+              </w:rPr>
+            </w:pPr>
+          </w:p>
+          <w:p>
+            <w:pPr>
+              <w:spacing w:after="0"/>
+              <w:rPr>
+                <w:rFonts w:ascii="Arial" w:hAnsi="Arial" w:cs="Arial"/>
+                <w:b/>
+                <w:bCs/>
+                <w:sz w:val="18"/>
+                <w:szCs w:val="18"/>
+                <w:lang w:val="ru-RU"/>
+              </w:rPr>
+            </w:pPr>
+            <w:r>
+              <w:rPr>
+                <w:rFonts w:ascii="Arial" w:hAnsi="Arial" w:cs="Arial"/>
+                <w:b/>
+                <w:bCs/>
+                <w:sz w:val="18"/>
+                <w:szCs w:val="18"/>
+                <w:lang w:val="ru-RU"/>
+              </w:rPr>
+              <w:t>УМЕРШИЕ В ЛАГЕРЯХ</w:t>
+            </w:r>
+          </w:p>
+        </w:tc>
+      </w:tr>
+      <w:tr>
+        <w:tc>
+          <w:tcPr>
+            <w:tcW w:w="11160" w:type="dxa"/>
+            <w:tcBorders>
+              <w:left w:val="double" w:sz="1" w:space="0" w:color="808080"/>
+              <w:bottom w:val="double" w:sz="1" w:space="0" w:color="808080"/>
+              <w:right w:val="double" w:sz="2" w:space="0" w:color="808080"/>
+            </w:tcBorders>
+            <w:vAlign w:val="center"/>
+          </w:tcPr>
+          <w:p>
+            <w:pPr>
+              <w:pStyle w:val="BodyText"/>
+              <w:pBdr>
+                <w:top w:val="none" w:sz="0" w:space="0" w:color="000000"/>
+                <w:left w:val="none" w:sz="0" w:space="0" w:color="000000"/>
+                <w:bottom w:val="none" w:sz="0" w:space="0" w:color="000000"/>
+                <w:right w:val="none" w:sz="0" w:space="0" w:color="000000"/>
+              </w:pBdr>
+              <w:tabs>
+                <w:tab w:val="left" w:pos="0"/>
+              </w:tabs>
+              <w:snapToGrid w:val="0"/>
+              <w:spacing w:after="0" w:line="240" w:lineRule="auto"/>
+              <w:rPr>
+                <w:rFonts w:ascii="Arial" w:hAnsi="Arial" w:cs="Arial"/>
+                <w:sz w:val="16"/>
+                <w:szCs w:val="16"/>
+                <w:lang w:val="ru-RU"/>
+              </w:rPr>
+            </w:pPr>
+            <w:proofErr w:type="spellStart"/>
+            <w:r>
+              <w:rPr>
+                <w:rFonts w:ascii="Arial" w:hAnsi="Arial" w:cs="Arial"/>
+                <w:b/>
+                <w:sz w:val="16"/>
+                <w:szCs w:val="16"/>
+                <w:lang w:val="ru-RU"/>
+              </w:rPr>
+              <w:t>Аюрзанова</w:t>
+            </w:r>
+            <w:proofErr w:type="spellEnd"/>
+            <w:r>
+              <w:rPr>
+                <w:rFonts w:ascii="Arial" w:hAnsi="Arial" w:cs="Arial"/>
+                <w:b/>
+                <w:sz w:val="16"/>
+                <w:szCs w:val="16"/>
+                <w:lang w:val="ru-RU"/>
+              </w:rPr>
+              <w:t xml:space="preserve"> </w:t>
+            </w:r>
+            <w:proofErr w:type="spellStart"/>
+            <w:r>
+              <w:rPr>
+                <w:rFonts w:ascii="Arial" w:hAnsi="Arial" w:cs="Arial"/>
+                <w:b/>
+                <w:sz w:val="16"/>
+                <w:szCs w:val="16"/>
+                <w:lang w:val="ru-RU"/>
+              </w:rPr>
+              <w:t>Дулма</w:t>
+            </w:r>
+            <w:proofErr w:type="spellEnd"/>
+            <w:r>
+              <w:rPr>
+                <w:rFonts w:ascii="Arial" w:hAnsi="Arial" w:cs="Arial"/>
+                <w:b/>
+                <w:sz w:val="16"/>
+                <w:szCs w:val="16"/>
+                <w:lang w:val="ru-RU"/>
+              </w:rPr>
+              <w:t xml:space="preserve"> 44 года умерла в ИТЛ</w:t>
+            </w:r>
+          </w:p>
+          <w:p>
+            <w:pPr>
+              <w:pStyle w:val="BodyText"/>
+              <w:pBdr>
+                <w:top w:val="none" w:sz="0" w:space="0" w:color="000000"/>
+                <w:left w:val="none" w:sz="0" w:space="0" w:color="000000"/>
+                <w:bottom w:val="none" w:sz="0" w:space="0" w:color="000000"/>
+                <w:right w:val="none" w:sz="0" w:space="0" w:color="000000"/>
+              </w:pBdr>
+              <w:tabs>
+                <w:tab w:val="left" w:pos="0"/>
+              </w:tabs>
+              <w:snapToGrid w:val="0"/>
+              <w:spacing w:after="0" w:line="240" w:lineRule="auto"/>
+              <w:rPr>
+                <w:rFonts w:ascii="Arial" w:hAnsi="Arial" w:cs="Arial"/>
+                <w:sz w:val="16"/>
+                <w:szCs w:val="16"/>
+                <w:lang w:val="ru-RU"/>
+              </w:rPr>
+            </w:pPr>
+            <w:r>
+              <w:rPr>
+                <w:rFonts w:ascii="Arial" w:hAnsi="Arial" w:cs="Arial"/>
+                <w:sz w:val="16"/>
+                <w:szCs w:val="16"/>
+                <w:lang w:val="ru-RU"/>
+              </w:rPr>
+              <w:t xml:space="preserve">1903 г.р., </w:t>
+            </w:r>
+            <w:proofErr w:type="spellStart"/>
+            <w:r>
+              <w:rPr>
+                <w:rFonts w:ascii="Arial" w:hAnsi="Arial" w:cs="Arial"/>
+                <w:sz w:val="16"/>
+                <w:szCs w:val="16"/>
+                <w:lang w:val="ru-RU"/>
+              </w:rPr>
+              <w:t>м.р</w:t>
+            </w:r>
+            <w:proofErr w:type="spellEnd"/>
+            <w:r>
+              <w:rPr>
+                <w:rFonts w:ascii="Arial" w:hAnsi="Arial" w:cs="Arial"/>
+                <w:sz w:val="16"/>
+                <w:szCs w:val="16"/>
+                <w:lang w:val="ru-RU"/>
+              </w:rPr>
+              <w:t xml:space="preserve">.: Забайкальская обл., Читинский уезд, с. </w:t>
+            </w:r>
+            <w:proofErr w:type="spellStart"/>
+            <w:r>
+              <w:rPr>
+                <w:rFonts w:ascii="Arial" w:hAnsi="Arial" w:cs="Arial"/>
+                <w:sz w:val="16"/>
+                <w:szCs w:val="16"/>
+                <w:lang w:val="ru-RU"/>
+              </w:rPr>
+              <w:t>Токчин</w:t>
+            </w:r>
+            <w:proofErr w:type="spellEnd"/>
+            <w:r>
+              <w:rPr>
+                <w:rFonts w:ascii="Arial" w:hAnsi="Arial" w:cs="Arial"/>
+                <w:sz w:val="16"/>
+                <w:szCs w:val="16"/>
+                <w:lang w:val="ru-RU"/>
+              </w:rPr>
+              <w:t xml:space="preserve">, бурятка. Работала в колхозе, </w:t>
+            </w:r>
+            <w:proofErr w:type="spellStart"/>
+            <w:r>
+              <w:rPr>
+                <w:rFonts w:ascii="Arial" w:hAnsi="Arial" w:cs="Arial"/>
+                <w:sz w:val="16"/>
+                <w:szCs w:val="16"/>
+                <w:lang w:val="ru-RU"/>
+              </w:rPr>
+              <w:t>прож</w:t>
+            </w:r>
+            <w:proofErr w:type="spellEnd"/>
+            <w:r>
+              <w:rPr>
+                <w:rFonts w:ascii="Arial" w:hAnsi="Arial" w:cs="Arial"/>
+                <w:sz w:val="16"/>
+                <w:szCs w:val="16"/>
+                <w:lang w:val="ru-RU"/>
+              </w:rPr>
+              <w:t xml:space="preserve">.: Читинская обл., Агинский округ, с. </w:t>
+            </w:r>
+            <w:proofErr w:type="spellStart"/>
+            <w:r>
+              <w:rPr>
+                <w:rFonts w:ascii="Arial" w:hAnsi="Arial" w:cs="Arial"/>
+                <w:sz w:val="16"/>
+                <w:szCs w:val="16"/>
+                <w:lang w:val="ru-RU"/>
+              </w:rPr>
+              <w:t>Токчин</w:t>
+            </w:r>
+            <w:proofErr w:type="spellEnd"/>
+            <w:r>
+              <w:rPr>
+                <w:rFonts w:ascii="Arial" w:hAnsi="Arial" w:cs="Arial"/>
+                <w:sz w:val="16"/>
+                <w:szCs w:val="16"/>
+                <w:lang w:val="ru-RU"/>
+              </w:rPr>
+              <w:t xml:space="preserve">, арестована 18.06.1945. Обвинение: по ст. </w:t>
+            </w:r>
+            <w:proofErr w:type="gramStart"/>
+            <w:r>
+              <w:rPr>
+                <w:rFonts w:ascii="Arial" w:hAnsi="Arial" w:cs="Arial"/>
+                <w:sz w:val="16"/>
+                <w:szCs w:val="16"/>
+                <w:lang w:val="ru-RU"/>
+              </w:rPr>
+              <w:t>58-10</w:t>
+            </w:r>
+            <w:proofErr w:type="gramEnd"/>
+            <w:r>
+              <w:rPr>
+                <w:rFonts w:ascii="Arial" w:hAnsi="Arial" w:cs="Arial"/>
+                <w:sz w:val="16"/>
+                <w:szCs w:val="16"/>
+                <w:lang w:val="ru-RU"/>
+              </w:rPr>
+              <w:t xml:space="preserve"> УК РСФСР. Приговор: Агинским окружным судом, 11.09.1945 – к 6 годам лишения свободы.</w:t>
+            </w:r>
+            <w:proofErr w:type="gramStart"/>
+            <w:r>
+              <w:rPr>
+                <w:rFonts w:ascii="Arial" w:hAnsi="Arial" w:cs="Arial"/>
+                <w:sz w:val="16"/>
+                <w:szCs w:val="16"/>
+                <w:lang w:val="ru-RU"/>
+              </w:rPr>
+              <w:t>, Умерла</w:t>
+            </w:r>
+            <w:proofErr w:type="gramEnd"/>
+            <w:r>
+              <w:rPr>
+                <w:rFonts w:ascii="Arial" w:hAnsi="Arial" w:cs="Arial"/>
+                <w:sz w:val="16"/>
+                <w:szCs w:val="16"/>
+                <w:lang w:val="ru-RU"/>
+              </w:rPr>
+              <w:t xml:space="preserve"> в ИТЛ _10.05.1947_ г. Реабилитация: прокуратурой Читинской обл., 27.04.1992. Состав семьи: Дочь Дарима – 8, мать </w:t>
+            </w:r>
+            <w:proofErr w:type="spellStart"/>
+            <w:r>
+              <w:rPr>
+                <w:rFonts w:ascii="Arial" w:hAnsi="Arial" w:cs="Arial"/>
+                <w:sz w:val="16"/>
+                <w:szCs w:val="16"/>
+                <w:lang w:val="ru-RU"/>
+              </w:rPr>
+              <w:t>Сындыма</w:t>
+            </w:r>
+            <w:proofErr w:type="spellEnd"/>
+            <w:r>
+              <w:rPr>
+                <w:rFonts w:ascii="Arial" w:hAnsi="Arial" w:cs="Arial"/>
+                <w:sz w:val="16"/>
+                <w:szCs w:val="16"/>
+                <w:lang w:val="ru-RU"/>
+              </w:rPr>
+              <w:t xml:space="preserve"> – 1875.</w:t>
+            </w:r>
+          </w:p>
+          <w:p>
+            <w:pPr>
+              <w:spacing w:after="0"/>
+              <w:rPr>
+                <w:lang w:val="ru-RU"/>
+              </w:rPr>
+            </w:pPr>
+            <w:r>
+              <w:rPr>
+                <w:rFonts w:ascii="Arial" w:hAnsi="Arial" w:cs="Arial"/>
+                <w:b/>
+                <w:bCs/>
+                <w:sz w:val="16"/>
+                <w:szCs w:val="16"/>
+                <w:lang w:val="ru-RU"/>
+              </w:rPr>
+              <w:t xml:space="preserve">Источник: Книга памяти Читинской обл., т.2; </w:t>
             </w:r>
             <w:hyperlink r:id="rId23" w:history="1">
               <w:r>
@@ -3187,229 +4381,43 @@
               <w:spacing w:after="0"/>
               <w:rPr>
                 <w:rFonts w:ascii="Arial" w:hAnsi="Arial" w:cs="Arial"/>
+                <w:sz w:val="16"/>
+                <w:szCs w:val="16"/>
+                <w:lang w:val="ru-RU"/>
+              </w:rPr>
+            </w:pPr>
+            <w:r>
+              <w:rPr>
+                <w:rFonts w:ascii="Arial" w:hAnsi="Arial" w:cs="Arial"/>
                 <w:b/>
                 <w:bCs/>
-                <w:sz w:val="18"/>
-                <w:szCs w:val="18"/>
-                <w:lang w:val="ru-RU"/>
-              </w:rPr>
-            </w:pPr>
-          </w:p>
-          <w:p>
-            <w:pPr>
-              <w:spacing w:after="0"/>
+                <w:sz w:val="16"/>
+                <w:szCs w:val="16"/>
+                <w:bdr w:val="none" w:sz="0" w:space="0" w:color="auto" w:frame="1"/>
+                <w:shd w:val="clear" w:color="auto" w:fill="FFFFFF"/>
+                <w:lang w:val="ru-RU"/>
+              </w:rPr>
+              <w:t>Цыбикова Чимит</w:t>
+            </w:r>
+            <w:r>
+              <w:rPr>
+                <w:rFonts w:ascii="Arial" w:hAnsi="Arial" w:cs="Arial"/>
+                <w:sz w:val="16"/>
+                <w:szCs w:val="16"/>
+                <w:lang w:val="ru-RU"/>
+              </w:rPr>
+              <w:t xml:space="preserve"> </w:t>
+            </w:r>
+            <w:r>
               <w:rPr>
                 <w:rFonts w:ascii="Arial" w:hAnsi="Arial" w:cs="Arial"/>
                 <w:b/>
                 <w:bCs/>
-                <w:sz w:val="18"/>
-                <w:szCs w:val="18"/>
-                <w:lang w:val="ru-RU"/>
-              </w:rPr>
-            </w:pPr>
-            <w:r>
-              <w:rPr>
-                <w:rFonts w:ascii="Arial" w:hAnsi="Arial" w:cs="Arial"/>
-                <w:b/>
-                <w:bCs/>
-                <w:sz w:val="18"/>
-                <w:szCs w:val="18"/>
-                <w:lang w:val="ru-RU"/>
-              </w:rPr>
-              <w:t>УМЕРШИЕ В ЛАГЕРЯХ</w:t>
-            </w:r>
-          </w:p>
-        </w:tc>
-      </w:tr>
-      <w:tr>
-        <w:tc>
-          <w:tcPr>
-            <w:tcW w:w="11160" w:type="dxa"/>
-            <w:tcBorders>
-              <w:left w:val="double" w:sz="1" w:space="0" w:color="808080"/>
-              <w:bottom w:val="double" w:sz="1" w:space="0" w:color="808080"/>
-              <w:right w:val="double" w:sz="2" w:space="0" w:color="808080"/>
-            </w:tcBorders>
-            <w:vAlign w:val="center"/>
-          </w:tcPr>
-          <w:p>
-            <w:pPr>
-              <w:pStyle w:val="BodyText"/>
-              <w:pBdr>
-                <w:top w:val="none" w:sz="0" w:space="0" w:color="000000"/>
-                <w:left w:val="none" w:sz="0" w:space="0" w:color="000000"/>
-                <w:bottom w:val="none" w:sz="0" w:space="0" w:color="000000"/>
-                <w:right w:val="none" w:sz="0" w:space="0" w:color="000000"/>
-              </w:pBdr>
-              <w:tabs>
-                <w:tab w:val="left" w:pos="0"/>
-              </w:tabs>
-              <w:snapToGrid w:val="0"/>
-              <w:spacing w:after="0" w:line="240" w:lineRule="auto"/>
-              <w:rPr>
-                <w:rFonts w:ascii="Arial" w:hAnsi="Arial" w:cs="Arial"/>
-                <w:sz w:val="16"/>
-                <w:szCs w:val="16"/>
-                <w:lang w:val="ru-RU"/>
-              </w:rPr>
-            </w:pPr>
-            <w:r>
-              <w:rPr>
-                <w:rFonts w:ascii="Arial" w:hAnsi="Arial" w:cs="Arial"/>
-                <w:b/>
-                <w:sz w:val="16"/>
-                <w:szCs w:val="16"/>
-                <w:lang w:val="ru-RU"/>
-              </w:rPr>
-              <w:t>Аюрзанова Дулма 44 года умерла в ИТЛ</w:t>
-            </w:r>
-          </w:p>
-          <w:p>
-            <w:pPr>
-              <w:pStyle w:val="BodyText"/>
-              <w:pBdr>
-                <w:top w:val="none" w:sz="0" w:space="0" w:color="000000"/>
-                <w:left w:val="none" w:sz="0" w:space="0" w:color="000000"/>
-                <w:bottom w:val="none" w:sz="0" w:space="0" w:color="000000"/>
-                <w:right w:val="none" w:sz="0" w:space="0" w:color="000000"/>
-              </w:pBdr>
-              <w:tabs>
-                <w:tab w:val="left" w:pos="0"/>
-              </w:tabs>
-              <w:snapToGrid w:val="0"/>
-              <w:spacing w:after="0" w:line="240" w:lineRule="auto"/>
-              <w:rPr>
-                <w:rFonts w:ascii="Arial" w:hAnsi="Arial" w:cs="Arial"/>
-                <w:sz w:val="16"/>
-                <w:szCs w:val="16"/>
-                <w:lang w:val="ru-RU"/>
-              </w:rPr>
-            </w:pPr>
-            <w:r>
-              <w:rPr>
-                <w:rFonts w:ascii="Arial" w:hAnsi="Arial" w:cs="Arial"/>
-                <w:sz w:val="16"/>
-                <w:szCs w:val="16"/>
-                <w:lang w:val="ru-RU"/>
-              </w:rPr>
-              <w:t>1903 г.р., м.р.: Забайкальская обл., Читинский уезд, с. Токчин, бурятка. Работала в колхозе, прож.: Читинская обл., Агинский округ, с. Токчин, арестована 18.06.1945. Обвинение: по ст. 58-10 УК РСФСР. Приговор: Агинским окружным судом, 11.09.1945 – к 6 годам лишения свободы., Умерла в ИТЛ _10.05.1947_ г. Реабилитация: прокуратурой Читинской обл., 27.04.1992. Состав семьи: Дочь Дарима – 8, мать Сындыма – 1875.</w:t>
-            </w:r>
-          </w:p>
-          <w:p>
-            <w:pPr>
-              <w:spacing w:after="0"/>
-              <w:rPr>
-                <w:lang w:val="ru-RU"/>
-              </w:rPr>
-            </w:pPr>
-            <w:r>
-              <w:rPr>
-                <w:rFonts w:ascii="Arial" w:hAnsi="Arial" w:cs="Arial"/>
-                <w:b/>
-                <w:bCs/>
-                <w:sz w:val="16"/>
-                <w:szCs w:val="16"/>
-                <w:lang w:val="ru-RU"/>
-              </w:rPr>
-              <w:t xml:space="preserve">Источник: Книга памяти Читинской обл., т.2; </w:t>
-            </w:r>
-            <w:hyperlink r:id="rId24" w:history="1">
-              <w:r>
-                <w:rPr>
-                  <w:rStyle w:val="Hyperlink"/>
-                  <w:rFonts w:ascii="Arial" w:hAnsi="Arial" w:cs="Arial"/>
-                  <w:b/>
-                  <w:bCs/>
-                  <w:color w:val="auto"/>
-                  <w:sz w:val="16"/>
-                  <w:szCs w:val="16"/>
-                  <w:lang w:val="ru-RU"/>
-                </w:rPr>
-                <w:t>Архивная ссылка</w:t>
-              </w:r>
-            </w:hyperlink>
-          </w:p>
-        </w:tc>
-      </w:tr>
-      <w:tr>
-        <w:tc>
-          <w:tcPr>
-            <w:tcW w:w="11160" w:type="dxa"/>
-            <w:tcBorders>
-              <w:left w:val="double" w:sz="1" w:space="0" w:color="808080"/>
-              <w:bottom w:val="double" w:sz="1" w:space="0" w:color="808080"/>
-              <w:right w:val="double" w:sz="2" w:space="0" w:color="808080"/>
-            </w:tcBorders>
-            <w:vAlign w:val="center"/>
-          </w:tcPr>
-          <w:p>
-            <w:pPr>
-              <w:spacing w:after="0"/>
-              <w:rPr>
-                <w:rFonts w:ascii="Arial" w:hAnsi="Arial" w:cs="Arial"/>
-                <w:sz w:val="16"/>
-                <w:szCs w:val="16"/>
-                <w:lang w:val="ru-RU"/>
-              </w:rPr>
-            </w:pPr>
-            <w:hyperlink r:id="rId25" w:history="1">
-              <w:r>
-                <w:rPr>
-                  <w:rStyle w:val="Hyperlink"/>
-                  <w:rFonts w:ascii="Arial" w:hAnsi="Arial" w:cs="Arial"/>
-                  <w:b/>
-                  <w:bCs/>
-                  <w:color w:val="auto"/>
-                  <w:sz w:val="16"/>
-                  <w:szCs w:val="16"/>
-                  <w:bdr w:val="none" w:sz="0" w:space="0" w:color="auto" w:frame="1"/>
-                  <w:shd w:val="clear" w:color="auto" w:fill="FFFFFF"/>
-                  <w:lang w:val="ru-RU"/>
-                </w:rPr>
-                <w:t>Цыбикова Чимит</w:t>
-              </w:r>
-            </w:hyperlink>
-            <w:r>
-              <w:rPr>
-                <w:rFonts w:ascii="Arial" w:hAnsi="Arial" w:cs="Arial"/>
-                <w:sz w:val="16"/>
-                <w:szCs w:val="16"/>
-                <w:lang w:val="ru-RU"/>
-              </w:rPr>
-              <w:t xml:space="preserve"> </w:t>
-            </w:r>
-            <w:r>
-              <w:rPr>
-                <w:rFonts w:ascii="Arial" w:hAnsi="Arial" w:cs="Arial"/>
-                <w:b/>
-                <w:bCs/>
-                <w:sz w:val="16"/>
-                <w:szCs w:val="16"/>
-                <w:lang w:val="ru-RU"/>
-              </w:rPr>
-              <w:t>43 года</w:t>
-            </w:r>
-            <w:r>
-              <w:rPr>
-                <w:rFonts w:ascii="Arial" w:hAnsi="Arial" w:cs="Arial"/>
-                <w:b/>
-                <w:bCs/>
-                <w:sz w:val="16"/>
-                <w:szCs w:val="16"/>
-                <w:lang w:val="ru-RU"/>
-              </w:rPr>
-              <w:t xml:space="preserve"> </w:t>
-            </w:r>
-            <w:r>
-              <w:rPr>
-                <w:rFonts w:ascii="Arial" w:hAnsi="Arial" w:cs="Arial"/>
-                <w:b/>
-                <w:bCs/>
-                <w:sz w:val="16"/>
-                <w:szCs w:val="16"/>
-                <w:lang w:val="ru-RU"/>
-              </w:rPr>
-              <w:t>умела в ИТЛ</w:t>
+                <w:sz w:val="16"/>
+                <w:szCs w:val="16"/>
+                <w:lang w:val="ru-RU"/>
+              </w:rPr>
+              <w:t>43 года умела в ИТЛ</w:t>
             </w:r>
             <w:r>
               <w:rPr>
@@ -3442,61 +4450,239 @@
                 <w:szCs w:val="16"/>
                 <w:lang w:val="ru-RU"/>
               </w:rPr>
-              <w:t>1905 г.р., м.р.: Забайкальская обл., Читинский уезд, с. Зугалай, бурятка, прож.: Читинская обл., Агинский Бурят-Монгольский национальный округ, с. Моготуй, привлечена без арестае: в соответствии с циркуляром НКВД и Прокуратуры СССР № 215/51с от _30.05.1942_ г. «О репрессировании членов семей изменников Родины»КВД СССР, 05.08.1944</w:t>
-            </w:r>
-            <w:r>
-              <w:rPr>
-                <w:rFonts w:ascii="Arial" w:hAnsi="Arial" w:cs="Arial"/>
-                <w:sz w:val="16"/>
-                <w:szCs w:val="16"/>
-                <w:lang w:val="ru-RU"/>
-              </w:rPr>
-              <w:t xml:space="preserve"> – </w:t>
-            </w:r>
-            <w:r>
-              <w:rPr>
-                <w:rFonts w:ascii="Arial" w:hAnsi="Arial" w:cs="Arial"/>
-                <w:sz w:val="16"/>
-                <w:szCs w:val="16"/>
-                <w:lang w:val="ru-RU"/>
-              </w:rPr>
-              <w:t>к 5 годам ссылки в Якутскую АССР., Умерла в 1948 г. (дата не указана). Реабилитация: прокуратурой Читинской обл., 24.10.1989. Состав семьи: Муж Цынгалеев Логичири Жамсаранович</w:t>
-            </w:r>
-            <w:r>
-              <w:rPr>
-                <w:rFonts w:ascii="Arial" w:hAnsi="Arial" w:cs="Arial"/>
-                <w:sz w:val="16"/>
-                <w:szCs w:val="16"/>
-                <w:lang w:val="ru-RU"/>
-              </w:rPr>
-              <w:t xml:space="preserve"> – </w:t>
-            </w:r>
-            <w:r>
-              <w:rPr>
-                <w:rFonts w:ascii="Arial" w:hAnsi="Arial" w:cs="Arial"/>
-                <w:sz w:val="16"/>
-                <w:szCs w:val="16"/>
-                <w:lang w:val="ru-RU"/>
-              </w:rPr>
-              <w:t>1906 (расстрелян _22.10.1942_ г.), дочь Удомбра</w:t>
-            </w:r>
-            <w:r>
-              <w:rPr>
-                <w:rFonts w:ascii="Arial" w:hAnsi="Arial" w:cs="Arial"/>
-                <w:sz w:val="16"/>
-                <w:szCs w:val="16"/>
-                <w:lang w:val="ru-RU"/>
-              </w:rPr>
-              <w:t xml:space="preserve"> – </w:t>
-            </w:r>
-            <w:r>
-              <w:rPr>
-                <w:rFonts w:ascii="Arial" w:hAnsi="Arial" w:cs="Arial"/>
-                <w:sz w:val="16"/>
-                <w:szCs w:val="16"/>
-                <w:lang w:val="ru-RU"/>
-              </w:rPr>
-              <w:t>11.</w:t>
+              <w:t xml:space="preserve">1905 г.р., </w:t>
+            </w:r>
+            <w:proofErr w:type="spellStart"/>
+            <w:r>
+              <w:rPr>
+                <w:rFonts w:ascii="Arial" w:hAnsi="Arial" w:cs="Arial"/>
+                <w:sz w:val="16"/>
+                <w:szCs w:val="16"/>
+                <w:lang w:val="ru-RU"/>
+              </w:rPr>
+              <w:t>м.р</w:t>
+            </w:r>
+            <w:proofErr w:type="spellEnd"/>
+            <w:r>
+              <w:rPr>
+                <w:rFonts w:ascii="Arial" w:hAnsi="Arial" w:cs="Arial"/>
+                <w:sz w:val="16"/>
+                <w:szCs w:val="16"/>
+                <w:lang w:val="ru-RU"/>
+              </w:rPr>
+              <w:t xml:space="preserve">.: Забайкальская обл., Читинский уезд, с. </w:t>
+            </w:r>
+            <w:proofErr w:type="spellStart"/>
+            <w:r>
+              <w:rPr>
+                <w:rFonts w:ascii="Arial" w:hAnsi="Arial" w:cs="Arial"/>
+                <w:sz w:val="16"/>
+                <w:szCs w:val="16"/>
+                <w:lang w:val="ru-RU"/>
+              </w:rPr>
+              <w:t>Зугалай</w:t>
+            </w:r>
+            <w:proofErr w:type="spellEnd"/>
+            <w:r>
+              <w:rPr>
+                <w:rFonts w:ascii="Arial" w:hAnsi="Arial" w:cs="Arial"/>
+                <w:sz w:val="16"/>
+                <w:szCs w:val="16"/>
+                <w:lang w:val="ru-RU"/>
+              </w:rPr>
+              <w:t xml:space="preserve">, бурятка, </w:t>
+            </w:r>
+            <w:proofErr w:type="spellStart"/>
+            <w:r>
+              <w:rPr>
+                <w:rFonts w:ascii="Arial" w:hAnsi="Arial" w:cs="Arial"/>
+                <w:sz w:val="16"/>
+                <w:szCs w:val="16"/>
+                <w:lang w:val="ru-RU"/>
+              </w:rPr>
+              <w:t>прож</w:t>
+            </w:r>
+            <w:proofErr w:type="spellEnd"/>
+            <w:r>
+              <w:rPr>
+                <w:rFonts w:ascii="Arial" w:hAnsi="Arial" w:cs="Arial"/>
+                <w:sz w:val="16"/>
+                <w:szCs w:val="16"/>
+                <w:lang w:val="ru-RU"/>
+              </w:rPr>
+              <w:t xml:space="preserve">.: Читинская обл., Агинский Бурят-Монгольский национальный округ, с. </w:t>
+            </w:r>
+            <w:proofErr w:type="spellStart"/>
+            <w:r>
+              <w:rPr>
+                <w:rFonts w:ascii="Arial" w:hAnsi="Arial" w:cs="Arial"/>
+                <w:sz w:val="16"/>
+                <w:szCs w:val="16"/>
+                <w:lang w:val="ru-RU"/>
+              </w:rPr>
+              <w:t>Моготуй</w:t>
+            </w:r>
+            <w:proofErr w:type="spellEnd"/>
+            <w:r>
+              <w:rPr>
+                <w:rFonts w:ascii="Arial" w:hAnsi="Arial" w:cs="Arial"/>
+                <w:sz w:val="16"/>
+                <w:szCs w:val="16"/>
+                <w:lang w:val="ru-RU"/>
+              </w:rPr>
+              <w:t xml:space="preserve">, привлечена без </w:t>
+            </w:r>
+            <w:proofErr w:type="spellStart"/>
+            <w:r>
+              <w:rPr>
+                <w:rFonts w:ascii="Arial" w:hAnsi="Arial" w:cs="Arial"/>
+                <w:sz w:val="16"/>
+                <w:szCs w:val="16"/>
+                <w:lang w:val="ru-RU"/>
+              </w:rPr>
+              <w:t>арестае</w:t>
+            </w:r>
+            <w:proofErr w:type="spellEnd"/>
+            <w:r>
+              <w:rPr>
+                <w:rFonts w:ascii="Arial" w:hAnsi="Arial" w:cs="Arial"/>
+                <w:sz w:val="16"/>
+                <w:szCs w:val="16"/>
+                <w:lang w:val="ru-RU"/>
+              </w:rPr>
+              <w:t xml:space="preserve">: в соответствии с циркуляром НКВД и Прокуратуры СССР № 215/51с от _30.05.1942_ г. «О репрессировании членов семей изменников </w:t>
+            </w:r>
+            <w:proofErr w:type="spellStart"/>
+            <w:proofErr w:type="gramStart"/>
+            <w:r>
+              <w:rPr>
+                <w:rFonts w:ascii="Arial" w:hAnsi="Arial" w:cs="Arial"/>
+                <w:sz w:val="16"/>
+                <w:szCs w:val="16"/>
+                <w:lang w:val="ru-RU"/>
+              </w:rPr>
+              <w:t>Родины»КВД</w:t>
+            </w:r>
+            <w:proofErr w:type="spellEnd"/>
+            <w:proofErr w:type="gramEnd"/>
+            <w:r>
+              <w:rPr>
+                <w:rFonts w:ascii="Arial" w:hAnsi="Arial" w:cs="Arial"/>
+                <w:sz w:val="16"/>
+                <w:szCs w:val="16"/>
+                <w:lang w:val="ru-RU"/>
+              </w:rPr>
+              <w:t xml:space="preserve"> СССР, 05.08.1944 – к 5 годам ссылки в Якутскую АССР.</w:t>
+            </w:r>
+            <w:proofErr w:type="gramStart"/>
+            <w:r>
+              <w:rPr>
+                <w:rFonts w:ascii="Arial" w:hAnsi="Arial" w:cs="Arial"/>
+                <w:sz w:val="16"/>
+                <w:szCs w:val="16"/>
+                <w:lang w:val="ru-RU"/>
+              </w:rPr>
+              <w:t>, Умерла</w:t>
+            </w:r>
+            <w:proofErr w:type="gramEnd"/>
+            <w:r>
+              <w:rPr>
+                <w:rFonts w:ascii="Arial" w:hAnsi="Arial" w:cs="Arial"/>
+                <w:sz w:val="16"/>
+                <w:szCs w:val="16"/>
+                <w:lang w:val="ru-RU"/>
+              </w:rPr>
+              <w:t xml:space="preserve"> в 1948 г. (дата не указана). Реабилитация: </w:t>
+            </w:r>
+            <w:r>
+              <w:rPr>
+                <w:rFonts w:ascii="Arial" w:hAnsi="Arial" w:cs="Arial"/>
+                <w:sz w:val="16"/>
+                <w:szCs w:val="16"/>
+                <w:lang w:val="ru-RU"/>
+              </w:rPr>
+              <w:lastRenderedPageBreak/>
+              <w:t xml:space="preserve">прокуратурой Читинской обл., 24.10.1989. Состав семьи: Муж </w:t>
+            </w:r>
+            <w:proofErr w:type="spellStart"/>
+            <w:r>
+              <w:rPr>
+                <w:rFonts w:ascii="Arial" w:hAnsi="Arial" w:cs="Arial"/>
+                <w:sz w:val="16"/>
+                <w:szCs w:val="16"/>
+                <w:lang w:val="ru-RU"/>
+              </w:rPr>
+              <w:t>Цынгалеев</w:t>
+            </w:r>
+            <w:proofErr w:type="spellEnd"/>
+            <w:r>
+              <w:rPr>
+                <w:rFonts w:ascii="Arial" w:hAnsi="Arial" w:cs="Arial"/>
+                <w:sz w:val="16"/>
+                <w:szCs w:val="16"/>
+                <w:lang w:val="ru-RU"/>
+              </w:rPr>
+              <w:t xml:space="preserve"> </w:t>
+            </w:r>
+            <w:proofErr w:type="spellStart"/>
+            <w:r>
+              <w:rPr>
+                <w:rFonts w:ascii="Arial" w:hAnsi="Arial" w:cs="Arial"/>
+                <w:sz w:val="16"/>
+                <w:szCs w:val="16"/>
+                <w:lang w:val="ru-RU"/>
+              </w:rPr>
+              <w:t>Логичири</w:t>
+            </w:r>
+            <w:proofErr w:type="spellEnd"/>
+            <w:r>
+              <w:rPr>
+                <w:rFonts w:ascii="Arial" w:hAnsi="Arial" w:cs="Arial"/>
+                <w:sz w:val="16"/>
+                <w:szCs w:val="16"/>
+                <w:lang w:val="ru-RU"/>
+              </w:rPr>
+              <w:t xml:space="preserve"> </w:t>
+            </w:r>
+            <w:proofErr w:type="spellStart"/>
+            <w:r>
+              <w:rPr>
+                <w:rFonts w:ascii="Arial" w:hAnsi="Arial" w:cs="Arial"/>
+                <w:sz w:val="16"/>
+                <w:szCs w:val="16"/>
+                <w:lang w:val="ru-RU"/>
+              </w:rPr>
+              <w:t>Жамсаранович</w:t>
+            </w:r>
+            <w:proofErr w:type="spellEnd"/>
+            <w:r>
+              <w:rPr>
+                <w:rFonts w:ascii="Arial" w:hAnsi="Arial" w:cs="Arial"/>
+                <w:sz w:val="16"/>
+                <w:szCs w:val="16"/>
+                <w:lang w:val="ru-RU"/>
+              </w:rPr>
+              <w:t xml:space="preserve"> – 1906 (расстрелян _22.10.1942_ г.), дочь </w:t>
+            </w:r>
+            <w:proofErr w:type="spellStart"/>
+            <w:r>
+              <w:rPr>
+                <w:rFonts w:ascii="Arial" w:hAnsi="Arial" w:cs="Arial"/>
+                <w:sz w:val="16"/>
+                <w:szCs w:val="16"/>
+                <w:lang w:val="ru-RU"/>
+              </w:rPr>
+              <w:t>Удомбра</w:t>
+            </w:r>
+            <w:proofErr w:type="spellEnd"/>
+            <w:r>
+              <w:rPr>
+                <w:rFonts w:ascii="Arial" w:hAnsi="Arial" w:cs="Arial"/>
+                <w:sz w:val="16"/>
+                <w:szCs w:val="16"/>
+                <w:lang w:val="ru-RU"/>
+              </w:rPr>
+              <w:t xml:space="preserve"> – 11.</w:t>
             </w:r>
           </w:p>
           <w:p>
@@ -3525,42 +4711,9 @@
                 <w:szCs w:val="16"/>
                 <w:lang w:val="ru-RU"/>
               </w:rPr>
-              <w:t>Источник: Книга памяти Читинской обл.</w:t>
-            </w:r>
-            <w:r>
-              <w:rPr>
-                <w:rFonts w:ascii="Arial" w:hAnsi="Arial" w:cs="Arial"/>
-                <w:b/>
-                <w:bCs/>
-                <w:sz w:val="16"/>
-                <w:szCs w:val="16"/>
-                <w:lang w:val="ru-RU"/>
-              </w:rPr>
-              <w:t>,</w:t>
-            </w:r>
-            <w:r>
-              <w:rPr>
-                <w:rFonts w:ascii="Arial" w:hAnsi="Arial" w:cs="Arial"/>
-                <w:b/>
-                <w:bCs/>
-                <w:sz w:val="16"/>
-                <w:szCs w:val="16"/>
-                <w:lang w:val="ru-RU"/>
-              </w:rPr>
-              <w:t xml:space="preserve"> т.6;</w:t>
-            </w:r>
-            <w:r>
-              <w:rPr>
-                <w:rFonts w:ascii="Arial" w:hAnsi="Arial" w:cs="Arial"/>
-                <w:b/>
-                <w:bCs/>
-                <w:sz w:val="16"/>
-                <w:szCs w:val="16"/>
-                <w:lang w:val="ru-RU"/>
-              </w:rPr>
-              <w:t xml:space="preserve"> </w:t>
-            </w:r>
-            <w:hyperlink r:id="rId26" w:history="1">
+              <w:t xml:space="preserve">Источник: Книга памяти Читинской обл., т.6; </w:t>
+            </w:r>
+            <w:hyperlink r:id="rId24" w:history="1">
               <w:r>
                 <w:rPr>
                   <w:rStyle w:val="Hyperlink"/>
@@ -3597,7 +4750,7 @@
 </file>
 
 <file path=word/numbering.xml><?xml version="1.0" encoding="utf-8"?>
-<w:numbering xmlns:wpc="http://schemas.microsoft.com/office/word/2010/wordprocessingCanvas" xmlns:cx="http://schemas.microsoft.com/office/drawing/2014/chartex" xmlns:cx1="http://schemas.microsoft.com/office/drawing/2015/9/8/chartex" xmlns:cx2="http://schemas.microsoft.com/office/drawing/2015/10/21/chartex" xmlns:cx3="http://schemas.microsoft.com/office/drawing/2016/5/9/chartex" xmlns:cx4="http://schemas.microsoft.com/office/drawing/2016/5/10/chartex" xmlns:cx5="http://schemas.microsoft.com/office/drawing/2016/5/11/chartex" xmlns:cx6="http://schemas.microsoft.com/office/drawing/2016/5/12/chartex" xmlns:cx7="http://schemas.microsoft.com/office/drawing/2016/5/13/chartex" xmlns:cx8="http://schemas.microsoft.com/office/drawing/2016/5/14/chartex" xmlns:mc="http://schemas.openxmlformats.org/markup-compatibility/2006" xmlns:aink="http://schemas.microsoft.com/office/drawing/2016/ink" xmlns:am3d="http://schemas.microsoft.com/office/drawing/2017/model3d" xmlns:o="urn:schemas-microsoft-com:office:office" xmlns:oel="http://schemas.microsoft.com/office/2019/extlst" xmlns:r="http://schemas.openxmlformats.org/officeDocument/2006/relationships" xmlns:m="http://schemas.openxmlformats.org/officeDocument/2006/math" xmlns:v="urn:schemas-microsoft-com:vml" xmlns:wp14="http://schemas.microsoft.com/office/word/2010/wordprocessingDrawing" xmlns:wp="http://schemas.openxmlformats.org/drawingml/2006/wordprocessingDrawing" xmlns:w10="urn:schemas-microsoft-com:office:word" xmlns:w="http://schemas.openxmlformats.org/wordprocessingml/2006/main" xmlns:w14="http://schemas.microsoft.com/office/word/2010/wordml" xmlns:w15="http://schemas.microsoft.com/office/word/2012/wordml" xmlns:w16cex="http://schemas.microsoft.com/office/word/2018/wordml/cex" xmlns:w16cid="http://schemas.microsoft.com/office/word/2016/wordml/cid" xmlns:w16="http://schemas.microsoft.com/office/word/2018/wordml" xmlns:w16du="http://schemas.microsoft.com/office/word/2023/wordml/word16du" xmlns:w16sdtdh="http://schemas.microsoft.com/office/word/2020/wordml/sdtdatahash" xmlns:w16sdtfl="http://schemas.microsoft.com/office/word/2024/wordml/sdtformatlock" xmlns:w16se="http://schemas.microsoft.com/office/word/2015/wordml/symex" xmlns:wpg="http://schemas.microsoft.com/office/word/2010/wordprocessingGroup" xmlns:wpi="http://schemas.microsoft.com/office/word/2010/wordprocessingInk" xmlns:wne="http://schemas.microsoft.com/office/word/2006/wordml" xmlns:wps="http://schemas.microsoft.com/office/word/2010/wordprocessingShape" mc:Ignorable="w14 w15 w16se w16cid w16 w16cex w16sdtdh w16sdtfl w16du wp14">
+<w:numbering xmlns:wpc="http://schemas.microsoft.com/office/word/2010/wordprocessingCanvas" xmlns:cx="http://schemas.microsoft.com/office/drawing/2014/chartex" xmlns:cx1="http://schemas.microsoft.com/office/drawing/2015/9/8/chartex" xmlns:cx2="http://schemas.microsoft.com/office/drawing/2015/10/21/chartex" xmlns:cx3="http://schemas.microsoft.com/office/drawing/2016/5/9/chartex" xmlns:cx4="http://schemas.microsoft.com/office/drawing/2016/5/10/chartex" xmlns:cx5="http://schemas.microsoft.com/office/drawing/2016/5/11/chartex" xmlns:cx6="http://schemas.microsoft.com/office/drawing/2016/5/12/chartex" xmlns:cx7="http://schemas.microsoft.com/office/drawing/2016/5/13/chartex" xmlns:cx8="http://schemas.microsoft.com/office/drawing/2016/5/14/chartex" xmlns:mc="http://schemas.openxmlformats.org/markup-compatibility/2006" xmlns:aink="http://schemas.microsoft.com/office/drawing/2016/ink" xmlns:am3d="http://schemas.microsoft.com/office/drawing/2017/model3d" xmlns:o="urn:schemas-microsoft-com:office:office" xmlns:oel="http://schemas.microsoft.com/office/2019/extlst" xmlns:r="http://schemas.openxmlformats.org/officeDocument/2006/relationships" xmlns:m="http://schemas.openxmlformats.org/officeDocument/2006/math" xmlns:v="urn:schemas-microsoft-com:vml" xmlns:wp14="http://schemas.microsoft.com/office/word/2010/wordprocessingDrawing" xmlns:wp="http://schemas.openxmlformats.org/drawingml/2006/wordprocessingDrawing" xmlns:w10="urn:schemas-microsoft-com:office:word" xmlns:w="http://schemas.openxmlformats.org/wordprocessingml/2006/main" xmlns:w14="http://schemas.microsoft.com/office/word/2010/wordml" xmlns:w15="http://schemas.microsoft.com/office/word/2012/wordml" xmlns:w16cei="http://schemas.microsoft.com/office/word/2026/wordml/cei" xmlns:w16cex="http://schemas.microsoft.com/office/word/2018/wordml/cex" xmlns:w16cid="http://schemas.microsoft.com/office/word/2016/wordml/cid" xmlns:w16="http://schemas.microsoft.com/office/word/2018/wordml" xmlns:w16du="http://schemas.microsoft.com/office/word/2023/wordml/word16du" xmlns:w16sdtdh="http://schemas.microsoft.com/office/word/2020/wordml/sdtdatahash" xmlns:w16sdtfl="http://schemas.microsoft.com/office/word/2024/wordml/sdtformatlock" xmlns:w16se="http://schemas.microsoft.com/office/word/2015/wordml/symex" xmlns:wpg="http://schemas.microsoft.com/office/word/2010/wordprocessingGroup" xmlns:wpi="http://schemas.microsoft.com/office/word/2010/wordprocessingInk" xmlns:wne="http://schemas.microsoft.com/office/word/2006/wordml" xmlns:wps="http://schemas.microsoft.com/office/word/2010/wordprocessingShape" mc:Ignorable="w14 w15 w16se w16cid w16 w16cex w16sdtdh w16sdtfl w16du wp14">
   <w:abstractNum w:abstractNumId="0" w15:restartNumberingAfterBreak="0">
     <w:nsid w:val="00000001"/>
     <w:multiLevelType w:val="multilevel"/>

</xml_diff>